<commit_message>
Update AquiferOpenBibleDictionary data for 2026-09-01 release
</commit_message>
<xml_diff>
--- a/fra/docx/002.content.docx
+++ b/fra/docx/002.content.docx
@@ -704,6 +704,99 @@
         <w:rPr>
           <w:lang w:val="fr_FR" w:bidi="fr_FR"/>
         </w:rPr>
+        <w:t>Baala</w:t>
+      </w:r>
+      <w:r>
+        <w:rPr>
+          <w:lang w:val="fr_FR" w:bidi="fr_FR"/>
+        </w:rPr>
+      </w:r>
+    </w:p>
+    <w:p>
+      <w:pPr/>
+      <w:r>
+        <w:rPr>
+          <w:lang w:val="fr_FR" w:bidi="fr_FR"/>
+        </w:rPr>
+      </w:r>
+      <w:r>
+        <w:rPr>
+          <w:lang w:val="fr_FR" w:bidi="fr_FR"/>
+        </w:rPr>
+        <w:t>Ville du sud de Canaan (</w:t>
+      </w:r>
+      <w:r>
+        <w:rPr>
+          <w:lang w:val="fr_FR" w:bidi="fr_FR"/>
+        </w:rPr>
+        <w:t>Jos 15.29</w:t>
+      </w:r>
+      <w:r>
+        <w:rPr>
+          <w:lang w:val="fr_FR" w:bidi="fr_FR"/>
+        </w:rPr>
+        <w:t>), probablement identique à Bala.</w:t>
+      </w:r>
+    </w:p>
+    <w:p>
+      <w:pPr/>
+      <w:r>
+        <w:rPr>
+          <w:lang w:val="fr_FR" w:bidi="fr_FR"/>
+        </w:rPr>
+      </w:r>
+      <w:r>
+        <w:rPr>
+          <w:i/>
+          <w:lang w:val="fr_FR" w:bidi="fr_FR"/>
+        </w:rPr>
+        <w:t>Voir</w:t>
+      </w:r>
+      <w:r>
+        <w:rPr>
+          <w:lang w:val="fr_FR" w:bidi="fr_FR"/>
+        </w:rPr>
+        <w:t xml:space="preserve"> </w:t>
+      </w:r>
+      <w:r>
+        <w:rPr>
+          <w:lang w:val="fr_FR" w:bidi="fr_FR"/>
+        </w:rPr>
+        <w:t>Bala</w:t>
+      </w:r>
+      <w:r>
+        <w:rPr>
+          <w:lang w:val="fr_FR" w:bidi="fr_FR"/>
+        </w:rPr>
+        <w:t>.</w:t>
+      </w:r>
+      <w:r>
+        <w:rPr>
+          <w:lang w:val="fr_FR" w:bidi="fr_FR"/>
+        </w:rPr>
+      </w:r>
+      <w:r>
+        <w:rPr>
+          <w:lang w:val="fr_FR" w:bidi="fr_FR"/>
+        </w:rPr>
+      </w:r>
+    </w:p>
+    <w:p>
+      <w:pPr/>
+      <w:r>
+        <w:rPr>
+          <w:lang w:val="fr_FR" w:bidi="fr_FR"/>
+        </w:rPr>
+      </w:r>
+    </w:p>
+    <w:p>
+      <w:pPr>
+        <w:pStyle w:val="Heading2"/>
+      </w:pPr>
+      <w:r>
+        <w:rPr>
+          <w:lang w:val="fr_FR" w:bidi="fr_FR"/>
+        </w:rPr>
         <w:t>Baalath</w:t>
       </w:r>
       <w:r>
@@ -2365,6 +2458,87 @@
         <w:rPr>
           <w:lang w:val="fr_FR" w:bidi="fr_FR"/>
         </w:rPr>
+        <w:t>Baalsamos</w:t>
+      </w:r>
+      <w:r>
+        <w:rPr>
+          <w:lang w:val="fr_FR" w:bidi="fr_FR"/>
+        </w:rPr>
+      </w:r>
+    </w:p>
+    <w:p>
+      <w:pPr/>
+      <w:r>
+        <w:rPr>
+          <w:lang w:val="fr_FR" w:bidi="fr_FR"/>
+        </w:rPr>
+      </w:r>
+      <w:r>
+        <w:rPr>
+          <w:lang w:val="fr_FR" w:bidi="fr_FR"/>
+        </w:rPr>
+        <w:t>Assistant lévite qui expliquait au peuple les passages de la Loi lus par Esdras (1 Esdras 9.43). Dans le passage correspondant de Néhémie, son nom est Maaséja.</w:t>
+      </w:r>
+    </w:p>
+    <w:p>
+      <w:pPr/>
+      <w:r>
+        <w:rPr>
+          <w:lang w:val="fr_FR" w:bidi="fr_FR"/>
+        </w:rPr>
+      </w:r>
+      <w:r>
+        <w:rPr>
+          <w:i/>
+          <w:lang w:val="fr_FR" w:bidi="fr_FR"/>
+        </w:rPr>
+        <w:t>Voir</w:t>
+      </w:r>
+      <w:r>
+        <w:rPr>
+          <w:lang w:val="fr_FR" w:bidi="fr_FR"/>
+        </w:rPr>
+        <w:t xml:space="preserve"> </w:t>
+      </w:r>
+      <w:r>
+        <w:rPr>
+          <w:lang w:val="fr_FR" w:bidi="fr_FR"/>
+        </w:rPr>
+        <w:t>Maaséja nº 11</w:t>
+      </w:r>
+      <w:r>
+        <w:rPr>
+          <w:lang w:val="fr_FR" w:bidi="fr_FR"/>
+        </w:rPr>
+        <w:t>.</w:t>
+      </w:r>
+      <w:r>
+        <w:rPr>
+          <w:lang w:val="fr_FR" w:bidi="fr_FR"/>
+        </w:rPr>
+      </w:r>
+      <w:r>
+        <w:rPr>
+          <w:lang w:val="fr_FR" w:bidi="fr_FR"/>
+        </w:rPr>
+      </w:r>
+    </w:p>
+    <w:p>
+      <w:pPr/>
+      <w:r>
+        <w:rPr>
+          <w:lang w:val="fr_FR" w:bidi="fr_FR"/>
+        </w:rPr>
+      </w:r>
+    </w:p>
+    <w:p>
+      <w:pPr>
+        <w:pStyle w:val="Heading2"/>
+      </w:pPr>
+      <w:r>
+        <w:rPr>
+          <w:lang w:val="fr_FR" w:bidi="fr_FR"/>
+        </w:rPr>
         <w:t>Baal-Schalischa</w:t>
       </w:r>
       <w:r>
@@ -4972,6 +5146,102 @@
         <w:rPr>
           <w:lang w:val="fr_FR" w:bidi="fr_FR"/>
         </w:rPr>
+        <w:t>Bagoas</w:t>
+      </w:r>
+      <w:r>
+        <w:rPr>
+          <w:lang w:val="fr_FR" w:bidi="fr_FR"/>
+        </w:rPr>
+      </w:r>
+    </w:p>
+    <w:p>
+      <w:pPr/>
+      <w:r>
+        <w:rPr>
+          <w:lang w:val="fr_FR" w:bidi="fr_FR"/>
+        </w:rPr>
+      </w:r>
+      <w:r>
+        <w:rPr>
+          <w:lang w:val="fr_FR" w:bidi="fr_FR"/>
+        </w:rPr>
+        <w:t>Eunuque au service d’Holopherne, le général de Nebucadnetsar (Jdt 12.11). Bagoas est celui qui découvre le corps du général après que Judith l'a décapité dans sa tente (Jdt 14.14–18). « Bagoas » est peut-être un titre persan plutôt qu'un nom.</w:t>
+      </w:r>
+      <w:r>
+        <w:rPr>
+          <w:lang w:val="fr_FR" w:bidi="fr_FR"/>
+        </w:rPr>
+      </w:r>
+      <w:r>
+        <w:rPr>
+          <w:lang w:val="fr_FR" w:bidi="fr_FR"/>
+        </w:rPr>
+      </w:r>
+    </w:p>
+    <w:p>
+      <w:pPr/>
+      <w:r>
+        <w:rPr>
+          <w:lang w:val="fr_FR" w:bidi="fr_FR"/>
+        </w:rPr>
+      </w:r>
+    </w:p>
+    <w:p>
+      <w:pPr>
+        <w:pStyle w:val="Heading2"/>
+      </w:pPr>
+      <w:r>
+        <w:rPr>
+          <w:lang w:val="fr_FR" w:bidi="fr_FR"/>
+        </w:rPr>
+        <w:t>Baïan (fils de)</w:t>
+      </w:r>
+      <w:r>
+        <w:rPr>
+          <w:lang w:val="fr_FR" w:bidi="fr_FR"/>
+        </w:rPr>
+      </w:r>
+    </w:p>
+    <w:p>
+      <w:pPr/>
+      <w:r>
+        <w:rPr>
+          <w:lang w:val="fr_FR" w:bidi="fr_FR"/>
+        </w:rPr>
+      </w:r>
+      <w:r>
+        <w:rPr>
+          <w:lang w:val="fr_FR" w:bidi="fr_FR"/>
+        </w:rPr>
+        <w:t>Tribu que Judas Maccabée détruit parce qu’elle tend régulièrement des embuscades aux voyageurs juifs (1 M 5.4–5). Rien d’autre n’est connu au sujet de cette tribu. Elle se trouve probablement à l’est du Jourdain.</w:t>
+      </w:r>
+      <w:r>
+        <w:rPr>
+          <w:lang w:val="fr_FR" w:bidi="fr_FR"/>
+        </w:rPr>
+      </w:r>
+      <w:r>
+        <w:rPr>
+          <w:lang w:val="fr_FR" w:bidi="fr_FR"/>
+        </w:rPr>
+      </w:r>
+    </w:p>
+    <w:p>
+      <w:pPr/>
+      <w:r>
+        <w:rPr>
+          <w:lang w:val="fr_FR" w:bidi="fr_FR"/>
+        </w:rPr>
+      </w:r>
+    </w:p>
+    <w:p>
+      <w:pPr>
+        <w:pStyle w:val="Heading2"/>
+      </w:pPr>
+      <w:r>
+        <w:rPr>
+          <w:lang w:val="fr_FR" w:bidi="fr_FR"/>
+        </w:rPr>
         <w:t>baie</w:t>
       </w:r>
       <w:r>
@@ -6379,6 +6649,54 @@
         <w:rPr>
           <w:lang w:val="fr_FR" w:bidi="fr_FR"/>
         </w:rPr>
+        <w:t>Bakénor</w:t>
+      </w:r>
+      <w:r>
+        <w:rPr>
+          <w:lang w:val="fr_FR" w:bidi="fr_FR"/>
+        </w:rPr>
+      </w:r>
+    </w:p>
+    <w:p>
+      <w:pPr/>
+      <w:r>
+        <w:rPr>
+          <w:lang w:val="fr_FR" w:bidi="fr_FR"/>
+        </w:rPr>
+      </w:r>
+      <w:r>
+        <w:rPr>
+          <w:lang w:val="fr_FR" w:bidi="fr_FR"/>
+        </w:rPr>
+        <w:t>Officier de Judas Maccabée selon 2 Maccabées 12.35. Le nom pourrait être une forme corrompue de « Toubien ». Comparer la Traduction œcuménique et la Traduction officielle liturgique : « Dosithée, du corps des Toubiens, vaillant cavalier » ; « Dosithée, parmi les soldats de Bakénor, cavalier et homme robuste ». Voir aussi 2 Maccabées 12.17.</w:t>
+      </w:r>
+      <w:r>
+        <w:rPr>
+          <w:lang w:val="fr_FR" w:bidi="fr_FR"/>
+        </w:rPr>
+      </w:r>
+      <w:r>
+        <w:rPr>
+          <w:lang w:val="fr_FR" w:bidi="fr_FR"/>
+        </w:rPr>
+      </w:r>
+    </w:p>
+    <w:p>
+      <w:pPr/>
+      <w:r>
+        <w:rPr>
+          <w:lang w:val="fr_FR" w:bidi="fr_FR"/>
+        </w:rPr>
+      </w:r>
+    </w:p>
+    <w:p>
+      <w:pPr>
+        <w:pStyle w:val="Heading2"/>
+      </w:pPr>
+      <w:r>
+        <w:rPr>
+          <w:lang w:val="fr_FR" w:bidi="fr_FR"/>
+        </w:rPr>
         <w:t>Bakkhidès</w:t>
       </w:r>
       <w:r>
@@ -7330,6 +7648,54 @@
         <w:rPr>
           <w:lang w:val="fr_FR" w:bidi="fr_FR"/>
         </w:rPr>
+        <w:t>Balamon</w:t>
+      </w:r>
+      <w:r>
+        <w:rPr>
+          <w:lang w:val="fr_FR" w:bidi="fr_FR"/>
+        </w:rPr>
+      </w:r>
+    </w:p>
+    <w:p>
+      <w:pPr/>
+      <w:r>
+        <w:rPr>
+          <w:lang w:val="fr_FR" w:bidi="fr_FR"/>
+        </w:rPr>
+      </w:r>
+      <w:r>
+        <w:rPr>
+          <w:lang w:val="fr_FR" w:bidi="fr_FR"/>
+        </w:rPr>
+        <w:t>Ville proche de l’endroit où Manassé, mari de Judith, est enterré (Jdt 8.3).</w:t>
+      </w:r>
+      <w:r>
+        <w:rPr>
+          <w:lang w:val="fr_FR" w:bidi="fr_FR"/>
+        </w:rPr>
+      </w:r>
+      <w:r>
+        <w:rPr>
+          <w:lang w:val="fr_FR" w:bidi="fr_FR"/>
+        </w:rPr>
+      </w:r>
+    </w:p>
+    <w:p>
+      <w:pPr/>
+      <w:r>
+        <w:rPr>
+          <w:lang w:val="fr_FR" w:bidi="fr_FR"/>
+        </w:rPr>
+      </w:r>
+    </w:p>
+    <w:p>
+      <w:pPr>
+        <w:pStyle w:val="Heading2"/>
+      </w:pPr>
+      <w:r>
+        <w:rPr>
+          <w:lang w:val="fr_FR" w:bidi="fr_FR"/>
+        </w:rPr>
         <w:t>balance</w:t>
       </w:r>
       <w:r>
@@ -7774,6 +8140,99 @@
         <w:rPr>
           <w:lang w:val="fr_FR" w:bidi="fr_FR"/>
         </w:rPr>
+        <w:t>Balaq</w:t>
+      </w:r>
+      <w:r>
+        <w:rPr>
+          <w:lang w:val="fr_FR" w:bidi="fr_FR"/>
+        </w:rPr>
+      </w:r>
+    </w:p>
+    <w:p>
+      <w:pPr/>
+      <w:r>
+        <w:rPr>
+          <w:lang w:val="fr_FR" w:bidi="fr_FR"/>
+        </w:rPr>
+      </w:r>
+      <w:r>
+        <w:rPr>
+          <w:lang w:val="fr_FR" w:bidi="fr_FR"/>
+        </w:rPr>
+        <w:t>Autre orthographe de « Balak ». Balak était roi de Moab à l’époque de Moïse (</w:t>
+      </w:r>
+      <w:r>
+        <w:rPr>
+          <w:lang w:val="fr_FR" w:bidi="fr_FR"/>
+        </w:rPr>
+        <w:t>Ap 2.14</w:t>
+      </w:r>
+      <w:r>
+        <w:rPr>
+          <w:lang w:val="fr_FR" w:bidi="fr_FR"/>
+        </w:rPr>
+        <w:t>).</w:t>
+      </w:r>
+    </w:p>
+    <w:p>
+      <w:pPr/>
+      <w:r>
+        <w:rPr>
+          <w:lang w:val="fr_FR" w:bidi="fr_FR"/>
+        </w:rPr>
+      </w:r>
+      <w:r>
+        <w:rPr>
+          <w:i/>
+          <w:lang w:val="fr_FR" w:bidi="fr_FR"/>
+        </w:rPr>
+        <w:t>Voir</w:t>
+      </w:r>
+      <w:r>
+        <w:rPr>
+          <w:lang w:val="fr_FR" w:bidi="fr_FR"/>
+        </w:rPr>
+        <w:t xml:space="preserve"> </w:t>
+      </w:r>
+      <w:r>
+        <w:rPr>
+          <w:lang w:val="fr_FR" w:bidi="fr_FR"/>
+        </w:rPr>
+        <w:t>Balak</w:t>
+      </w:r>
+      <w:r>
+        <w:rPr>
+          <w:lang w:val="fr_FR" w:bidi="fr_FR"/>
+        </w:rPr>
+        <w:t>.</w:t>
+      </w:r>
+      <w:r>
+        <w:rPr>
+          <w:lang w:val="fr_FR" w:bidi="fr_FR"/>
+        </w:rPr>
+      </w:r>
+      <w:r>
+        <w:rPr>
+          <w:lang w:val="fr_FR" w:bidi="fr_FR"/>
+        </w:rPr>
+      </w:r>
+    </w:p>
+    <w:p>
+      <w:pPr/>
+      <w:r>
+        <w:rPr>
+          <w:lang w:val="fr_FR" w:bidi="fr_FR"/>
+        </w:rPr>
+      </w:r>
+    </w:p>
+    <w:p>
+      <w:pPr>
+        <w:pStyle w:val="Heading2"/>
+      </w:pPr>
+      <w:r>
+        <w:rPr>
+          <w:lang w:val="fr_FR" w:bidi="fr_FR"/>
+        </w:rPr>
         <w:t>Balbuzard</w:t>
       </w:r>
       <w:r>
@@ -8012,6 +8471,99 @@
           <w:lang w:val="fr_FR" w:bidi="fr_FR"/>
         </w:rPr>
         <w:t>. C'est une sorte de virevoltant de la famille des chardons (traduit « balles de chardons » dans la Nouvelle Bible Segond). Il s'agit d'une herbe épineuse dont le suc est laiteux. Elle roule sur le sol et s'accumule en d'énormes tas dans les endroits creux.</w:t>
+      </w:r>
+      <w:r>
+        <w:rPr>
+          <w:lang w:val="fr_FR" w:bidi="fr_FR"/>
+        </w:rPr>
+      </w:r>
+      <w:r>
+        <w:rPr>
+          <w:lang w:val="fr_FR" w:bidi="fr_FR"/>
+        </w:rPr>
+      </w:r>
+    </w:p>
+    <w:p>
+      <w:pPr/>
+      <w:r>
+        <w:rPr>
+          <w:lang w:val="fr_FR" w:bidi="fr_FR"/>
+        </w:rPr>
+      </w:r>
+    </w:p>
+    <w:p>
+      <w:pPr>
+        <w:pStyle w:val="Heading2"/>
+      </w:pPr>
+      <w:r>
+        <w:rPr>
+          <w:lang w:val="fr_FR" w:bidi="fr_FR"/>
+        </w:rPr>
+        <w:t>Balthazar</w:t>
+      </w:r>
+      <w:r>
+        <w:rPr>
+          <w:lang w:val="fr_FR" w:bidi="fr_FR"/>
+        </w:rPr>
+      </w:r>
+    </w:p>
+    <w:p>
+      <w:pPr/>
+      <w:r>
+        <w:rPr>
+          <w:lang w:val="fr_FR" w:bidi="fr_FR"/>
+        </w:rPr>
+      </w:r>
+      <w:r>
+        <w:rPr>
+          <w:lang w:val="fr_FR" w:bidi="fr_FR"/>
+        </w:rPr>
+        <w:t xml:space="preserve">Nom traditionnel de l’un des mages qui apportent un présent à Jésus dans </w:t>
+      </w:r>
+      <w:r>
+        <w:rPr>
+          <w:lang w:val="fr_FR" w:bidi="fr_FR"/>
+        </w:rPr>
+        <w:t>Matthieu 2.1–2</w:t>
+      </w:r>
+      <w:r>
+        <w:rPr>
+          <w:lang w:val="fr_FR" w:bidi="fr_FR"/>
+        </w:rPr>
+        <w:t xml:space="preserve">. </w:t>
+      </w:r>
+    </w:p>
+    <w:p>
+      <w:pPr/>
+      <w:r>
+        <w:rPr>
+          <w:lang w:val="fr_FR" w:bidi="fr_FR"/>
+        </w:rPr>
+      </w:r>
+      <w:r>
+        <w:rPr>
+          <w:i/>
+          <w:lang w:val="fr_FR" w:bidi="fr_FR"/>
+        </w:rPr>
+        <w:t>Voir</w:t>
+      </w:r>
+      <w:r>
+        <w:rPr>
+          <w:lang w:val="fr_FR" w:bidi="fr_FR"/>
+        </w:rPr>
+        <w:t xml:space="preserve"> </w:t>
+      </w:r>
+      <w:r>
+        <w:rPr>
+          <w:lang w:val="fr_FR" w:bidi="fr_FR"/>
+        </w:rPr>
+        <w:t>mages</w:t>
+      </w:r>
+      <w:r>
+        <w:rPr>
+          <w:lang w:val="fr_FR" w:bidi="fr_FR"/>
+        </w:rPr>
+        <w:t>.</w:t>
       </w:r>
       <w:r>
         <w:rPr>
@@ -11094,6 +11646,87 @@
         <w:rPr>
           <w:lang w:val="fr_FR" w:bidi="fr_FR"/>
         </w:rPr>
+        <w:t>bar</w:t>
+      </w:r>
+      <w:r>
+        <w:rPr>
+          <w:lang w:val="fr_FR" w:bidi="fr_FR"/>
+        </w:rPr>
+      </w:r>
+    </w:p>
+    <w:p>
+      <w:pPr/>
+      <w:r>
+        <w:rPr>
+          <w:lang w:val="fr_FR" w:bidi="fr_FR"/>
+        </w:rPr>
+      </w:r>
+      <w:r>
+        <w:rPr>
+          <w:lang w:val="fr_FR" w:bidi="fr_FR"/>
+        </w:rPr>
+        <w:t>Terme araméen désignant un lien familial étroit. Par exemple, Simon Barjonas (voir Mt 16.17, Darby) signifie « Simon, fils de Jonas ».</w:t>
+      </w:r>
+    </w:p>
+    <w:p>
+      <w:pPr/>
+      <w:r>
+        <w:rPr>
+          <w:lang w:val="fr_FR" w:bidi="fr_FR"/>
+        </w:rPr>
+      </w:r>
+      <w:r>
+        <w:rPr>
+          <w:i/>
+          <w:lang w:val="fr_FR" w:bidi="fr_FR"/>
+        </w:rPr>
+        <w:t>Voir aussi</w:t>
+      </w:r>
+      <w:r>
+        <w:rPr>
+          <w:lang w:val="fr_FR" w:bidi="fr_FR"/>
+        </w:rPr>
+        <w:t xml:space="preserve"> </w:t>
+      </w:r>
+      <w:r>
+        <w:rPr>
+          <w:lang w:val="fr_FR" w:bidi="fr_FR"/>
+        </w:rPr>
+        <w:t>Ben (nom)</w:t>
+      </w:r>
+      <w:r>
+        <w:rPr>
+          <w:lang w:val="fr_FR" w:bidi="fr_FR"/>
+        </w:rPr>
+        <w:t>.</w:t>
+      </w:r>
+      <w:r>
+        <w:rPr>
+          <w:lang w:val="fr_FR" w:bidi="fr_FR"/>
+        </w:rPr>
+      </w:r>
+      <w:r>
+        <w:rPr>
+          <w:lang w:val="fr_FR" w:bidi="fr_FR"/>
+        </w:rPr>
+      </w:r>
+    </w:p>
+    <w:p>
+      <w:pPr/>
+      <w:r>
+        <w:rPr>
+          <w:lang w:val="fr_FR" w:bidi="fr_FR"/>
+        </w:rPr>
+      </w:r>
+    </w:p>
+    <w:p>
+      <w:pPr>
+        <w:pStyle w:val="Heading2"/>
+      </w:pPr>
+      <w:r>
+        <w:rPr>
+          <w:lang w:val="fr_FR" w:bidi="fr_FR"/>
+        </w:rPr>
         <w:t>Barabbas</w:t>
       </w:r>
       <w:r>
@@ -11647,6 +12280,99 @@
         <w:rPr>
           <w:lang w:val="fr_FR" w:bidi="fr_FR"/>
         </w:rPr>
+        <w:t>Barakéel</w:t>
+      </w:r>
+      <w:r>
+        <w:rPr>
+          <w:lang w:val="fr_FR" w:bidi="fr_FR"/>
+        </w:rPr>
+      </w:r>
+    </w:p>
+    <w:p>
+      <w:pPr/>
+      <w:r>
+        <w:rPr>
+          <w:lang w:val="fr_FR" w:bidi="fr_FR"/>
+        </w:rPr>
+      </w:r>
+      <w:r>
+        <w:rPr>
+          <w:lang w:val="fr_FR" w:bidi="fr_FR"/>
+        </w:rPr>
+        <w:t xml:space="preserve">Autre orthographe de Barakeel, père d’Élihu (voir </w:t>
+      </w:r>
+      <w:r>
+        <w:rPr>
+          <w:lang w:val="fr_FR" w:bidi="fr_FR"/>
+        </w:rPr>
+        <w:t>Jb 32.2</w:t>
+      </w:r>
+      <w:r>
+        <w:rPr>
+          <w:lang w:val="fr_FR" w:bidi="fr_FR"/>
+        </w:rPr>
+        <w:t>).</w:t>
+      </w:r>
+    </w:p>
+    <w:p>
+      <w:pPr/>
+      <w:r>
+        <w:rPr>
+          <w:lang w:val="fr_FR" w:bidi="fr_FR"/>
+        </w:rPr>
+      </w:r>
+      <w:r>
+        <w:rPr>
+          <w:i/>
+          <w:lang w:val="fr_FR" w:bidi="fr_FR"/>
+        </w:rPr>
+        <w:t>Voir</w:t>
+      </w:r>
+      <w:r>
+        <w:rPr>
+          <w:lang w:val="fr_FR" w:bidi="fr_FR"/>
+        </w:rPr>
+        <w:t xml:space="preserve"> </w:t>
+      </w:r>
+      <w:r>
+        <w:rPr>
+          <w:lang w:val="fr_FR" w:bidi="fr_FR"/>
+        </w:rPr>
+        <w:t>Barakeel</w:t>
+      </w:r>
+      <w:r>
+        <w:rPr>
+          <w:lang w:val="fr_FR" w:bidi="fr_FR"/>
+        </w:rPr>
+        <w:t>.</w:t>
+      </w:r>
+      <w:r>
+        <w:rPr>
+          <w:lang w:val="fr_FR" w:bidi="fr_FR"/>
+        </w:rPr>
+      </w:r>
+      <w:r>
+        <w:rPr>
+          <w:lang w:val="fr_FR" w:bidi="fr_FR"/>
+        </w:rPr>
+      </w:r>
+    </w:p>
+    <w:p>
+      <w:pPr/>
+      <w:r>
+        <w:rPr>
+          <w:lang w:val="fr_FR" w:bidi="fr_FR"/>
+        </w:rPr>
+      </w:r>
+    </w:p>
+    <w:p>
+      <w:pPr>
+        <w:pStyle w:val="Heading2"/>
+      </w:pPr>
+      <w:r>
+        <w:rPr>
+          <w:lang w:val="fr_FR" w:bidi="fr_FR"/>
+        </w:rPr>
         <w:t>Barbare</w:t>
       </w:r>
       <w:r>
@@ -12185,6 +12911,123 @@
           <w:lang w:val="fr_FR" w:bidi="fr_FR"/>
         </w:rPr>
         <w:t>). Les Juifs ayant des liens avec la culture grecque adoptaient souvent des noms grecs. Certains pensent qu'Élymas vient d'un mot araméen signifiant « fort » et d'un mot arabe signifiant « sage », qui peut également signifier « magicien ».</w:t>
+      </w:r>
+      <w:r>
+        <w:rPr>
+          <w:lang w:val="fr_FR" w:bidi="fr_FR"/>
+        </w:rPr>
+      </w:r>
+      <w:r>
+        <w:rPr>
+          <w:lang w:val="fr_FR" w:bidi="fr_FR"/>
+        </w:rPr>
+      </w:r>
+    </w:p>
+    <w:p>
+      <w:pPr/>
+      <w:r>
+        <w:rPr>
+          <w:lang w:val="fr_FR" w:bidi="fr_FR"/>
+        </w:rPr>
+      </w:r>
+    </w:p>
+    <w:p>
+      <w:pPr>
+        <w:pStyle w:val="Heading2"/>
+      </w:pPr>
+      <w:r>
+        <w:rPr>
+          <w:lang w:val="fr_FR" w:bidi="fr_FR"/>
+        </w:rPr>
+        <w:t>Bar-Jonas</w:t>
+      </w:r>
+      <w:r>
+        <w:rPr>
+          <w:lang w:val="fr_FR" w:bidi="fr_FR"/>
+        </w:rPr>
+      </w:r>
+    </w:p>
+    <w:p>
+      <w:pPr/>
+      <w:r>
+        <w:rPr>
+          <w:lang w:val="fr_FR" w:bidi="fr_FR"/>
+        </w:rPr>
+      </w:r>
+      <w:r>
+        <w:rPr>
+          <w:lang w:val="fr_FR" w:bidi="fr_FR"/>
+        </w:rPr>
+        <w:t>Équivalent du nom de famille de Simon Pierre en araméen. Ce nom signifie « fils de Jonas » (</w:t>
+      </w:r>
+      <w:r>
+        <w:rPr>
+          <w:lang w:val="fr_FR" w:bidi="fr_FR"/>
+        </w:rPr>
+        <w:t>Mt 16.17</w:t>
+      </w:r>
+      <w:r>
+        <w:rPr>
+          <w:lang w:val="fr_FR" w:bidi="fr_FR"/>
+        </w:rPr>
+        <w:t xml:space="preserve">). Une autre version de ce nom apparaît dans </w:t>
+      </w:r>
+      <w:r>
+        <w:rPr>
+          <w:lang w:val="fr_FR" w:bidi="fr_FR"/>
+        </w:rPr>
+        <w:t>Jean 1.42</w:t>
+      </w:r>
+      <w:r>
+        <w:rPr>
+          <w:lang w:val="fr_FR" w:bidi="fr_FR"/>
+        </w:rPr>
+        <w:t xml:space="preserve"> et </w:t>
+      </w:r>
+      <w:r>
+        <w:rPr>
+          <w:lang w:val="fr_FR" w:bidi="fr_FR"/>
+        </w:rPr>
+        <w:t>21.15–17</w:t>
+      </w:r>
+      <w:r>
+        <w:rPr>
+          <w:lang w:val="fr_FR" w:bidi="fr_FR"/>
+        </w:rPr>
+        <w:t>, où les meilleurs manuscrits grecs portent « fils de Jean » plutôt que « fils de Jonas ».</w:t>
+      </w:r>
+    </w:p>
+    <w:p>
+      <w:pPr/>
+      <w:r>
+        <w:rPr>
+          <w:lang w:val="fr_FR" w:bidi="fr_FR"/>
+        </w:rPr>
+      </w:r>
+      <w:r>
+        <w:rPr>
+          <w:i/>
+          <w:lang w:val="fr_FR" w:bidi="fr_FR"/>
+        </w:rPr>
+        <w:t>Voir</w:t>
+      </w:r>
+      <w:r>
+        <w:rPr>
+          <w:lang w:val="fr_FR" w:bidi="fr_FR"/>
+        </w:rPr>
+        <w:t xml:space="preserve"> </w:t>
+      </w:r>
+      <w:r>
+        <w:rPr>
+          <w:lang w:val="fr_FR" w:bidi="fr_FR"/>
+        </w:rPr>
+        <w:t>Simon Pierre</w:t>
+      </w:r>
+      <w:r>
+        <w:rPr>
+          <w:lang w:val="fr_FR" w:bidi="fr_FR"/>
+        </w:rPr>
+        <w:t>.</w:t>
       </w:r>
       <w:r>
         <w:rPr>
@@ -12470,6 +13313,87 @@
         <w:rPr>
           <w:lang w:val="fr_FR" w:bidi="fr_FR"/>
         </w:rPr>
+        <w:t>Bar-Koseva</w:t>
+      </w:r>
+      <w:r>
+        <w:rPr>
+          <w:lang w:val="fr_FR" w:bidi="fr_FR"/>
+        </w:rPr>
+      </w:r>
+    </w:p>
+    <w:p>
+      <w:pPr/>
+      <w:r>
+        <w:rPr>
+          <w:lang w:val="fr_FR" w:bidi="fr_FR"/>
+        </w:rPr>
+      </w:r>
+      <w:r>
+        <w:rPr>
+          <w:lang w:val="fr_FR" w:bidi="fr_FR"/>
+        </w:rPr>
+        <w:t>Nom original de Shimon bar Kokhba, chef de la révolte juive contre les Romains en Palestine sous le règne de l’empereur Hadrien.</w:t>
+      </w:r>
+    </w:p>
+    <w:p>
+      <w:pPr/>
+      <w:r>
+        <w:rPr>
+          <w:lang w:val="fr_FR" w:bidi="fr_FR"/>
+        </w:rPr>
+      </w:r>
+      <w:r>
+        <w:rPr>
+          <w:i/>
+          <w:lang w:val="fr_FR" w:bidi="fr_FR"/>
+        </w:rPr>
+        <w:t>Voir</w:t>
+      </w:r>
+      <w:r>
+        <w:rPr>
+          <w:lang w:val="fr_FR" w:bidi="fr_FR"/>
+        </w:rPr>
+        <w:t xml:space="preserve"> </w:t>
+      </w:r>
+      <w:r>
+        <w:rPr>
+          <w:lang w:val="fr_FR" w:bidi="fr_FR"/>
+        </w:rPr>
+        <w:t>Bar-Kokhba, Bar-Kochba</w:t>
+      </w:r>
+      <w:r>
+        <w:rPr>
+          <w:lang w:val="fr_FR" w:bidi="fr_FR"/>
+        </w:rPr>
+        <w:t>.</w:t>
+      </w:r>
+      <w:r>
+        <w:rPr>
+          <w:lang w:val="fr_FR" w:bidi="fr_FR"/>
+        </w:rPr>
+      </w:r>
+      <w:r>
+        <w:rPr>
+          <w:lang w:val="fr_FR" w:bidi="fr_FR"/>
+        </w:rPr>
+      </w:r>
+    </w:p>
+    <w:p>
+      <w:pPr/>
+      <w:r>
+        <w:rPr>
+          <w:lang w:val="fr_FR" w:bidi="fr_FR"/>
+        </w:rPr>
+      </w:r>
+    </w:p>
+    <w:p>
+      <w:pPr>
+        <w:pStyle w:val="Heading2"/>
+      </w:pPr>
+      <w:r>
+        <w:rPr>
+          <w:lang w:val="fr_FR" w:bidi="fr_FR"/>
+        </w:rPr>
         <w:t>Barnabas</w:t>
       </w:r>
       <w:r>
@@ -12874,6 +13798,129 @@
           <w:lang w:val="fr_FR" w:bidi="fr_FR"/>
         </w:rPr>
         <w:t>Néhémie 7.57–59</w:t>
+      </w:r>
+      <w:r>
+        <w:rPr>
+          <w:lang w:val="fr_FR" w:bidi="fr_FR"/>
+        </w:rPr>
+        <w:t>.</w:t>
+      </w:r>
+      <w:r>
+        <w:rPr>
+          <w:lang w:val="fr_FR" w:bidi="fr_FR"/>
+        </w:rPr>
+      </w:r>
+      <w:r>
+        <w:rPr>
+          <w:lang w:val="fr_FR" w:bidi="fr_FR"/>
+        </w:rPr>
+      </w:r>
+    </w:p>
+    <w:p>
+      <w:pPr/>
+      <w:r>
+        <w:rPr>
+          <w:lang w:val="fr_FR" w:bidi="fr_FR"/>
+        </w:rPr>
+      </w:r>
+    </w:p>
+    <w:p>
+      <w:pPr>
+        <w:pStyle w:val="Heading2"/>
+      </w:pPr>
+      <w:r>
+        <w:rPr>
+          <w:lang w:val="fr_FR" w:bidi="fr_FR"/>
+        </w:rPr>
+        <w:t>barque</w:t>
+      </w:r>
+      <w:r>
+        <w:rPr>
+          <w:lang w:val="fr_FR" w:bidi="fr_FR"/>
+        </w:rPr>
+      </w:r>
+    </w:p>
+    <w:p>
+      <w:pPr/>
+      <w:r>
+        <w:rPr>
+          <w:lang w:val="fr_FR" w:bidi="fr_FR"/>
+        </w:rPr>
+      </w:r>
+      <w:r>
+        <w:rPr>
+          <w:lang w:val="fr_FR" w:bidi="fr_FR"/>
+        </w:rPr>
+        <w:t xml:space="preserve">Petite embarcation utilisée pour se déplacer sur l’eau. Une barque flotte sur l'eau ; elle a des rebords tout autour qui permettent de protéger de l'eau occupants et objets. </w:t>
+      </w:r>
+    </w:p>
+    <w:p>
+      <w:pPr/>
+      <w:r>
+        <w:rPr>
+          <w:lang w:val="fr_FR" w:bidi="fr_FR"/>
+        </w:rPr>
+      </w:r>
+      <w:r>
+        <w:rPr>
+          <w:lang w:val="fr_FR" w:bidi="fr_FR"/>
+        </w:rPr>
+        <w:t xml:space="preserve">Dans la Bible, on utilisait des barques pour pêcher ou pour traverser des lacs ou des fleuves. Le mot « chaloupe » est souvent utilisé en français pour désigner un type d'embarcation similaire qui sert d'embarcation de sauvetage à bord de navires. </w:t>
+      </w:r>
+    </w:p>
+    <w:p>
+      <w:pPr/>
+      <w:r>
+        <w:rPr>
+          <w:lang w:val="fr_FR" w:bidi="fr_FR"/>
+        </w:rPr>
+      </w:r>
+      <w:r>
+        <w:rPr>
+          <w:lang w:val="fr_FR" w:bidi="fr_FR"/>
+        </w:rPr>
+        <w:t>Les barques se déplaçaient par l'action de rames (longues perches utilisées pour pousser dans l'eau) ou de voiles (des toiles que pousse le vent).</w:t>
+      </w:r>
+    </w:p>
+    <w:p>
+      <w:pPr/>
+      <w:r>
+        <w:rPr>
+          <w:lang w:val="fr_FR" w:bidi="fr_FR"/>
+        </w:rPr>
+      </w:r>
+      <w:r>
+        <w:rPr>
+          <w:lang w:val="fr_FR" w:bidi="fr_FR"/>
+        </w:rPr>
+        <w:t>Plusieurs des disciples de Jésus étaient pêcheurs et beaucoup du ministère de Jésus a eu lieu dans la région près de la mer de Galilée. Des barques sont donc souvent mentionnés dans les récits des Évangiles.</w:t>
+      </w:r>
+    </w:p>
+    <w:p>
+      <w:pPr/>
+      <w:r>
+        <w:rPr>
+          <w:lang w:val="fr_FR" w:bidi="fr_FR"/>
+        </w:rPr>
+      </w:r>
+      <w:r>
+        <w:rPr>
+          <w:i/>
+          <w:lang w:val="fr_FR" w:bidi="fr_FR"/>
+        </w:rPr>
+        <w:t>Voir</w:t>
+      </w:r>
+      <w:r>
+        <w:rPr>
+          <w:lang w:val="fr_FR" w:bidi="fr_FR"/>
+        </w:rPr>
+        <w:t xml:space="preserve"> </w:t>
+      </w:r>
+      <w:r>
+        <w:rPr>
+          <w:lang w:val="fr_FR" w:bidi="fr_FR"/>
+        </w:rPr>
+        <w:t>voyages</w:t>
       </w:r>
       <w:r>
         <w:rPr>
@@ -15318,6 +16365,121 @@
         <w:rPr>
           <w:lang w:val="fr_FR" w:bidi="fr_FR"/>
         </w:rPr>
+        <w:t>bâtiments, constructions, édifices</w:t>
+      </w:r>
+      <w:r>
+        <w:rPr>
+          <w:lang w:val="fr_FR" w:bidi="fr_FR"/>
+        </w:rPr>
+      </w:r>
+    </w:p>
+    <w:p>
+      <w:pPr/>
+      <w:r>
+        <w:rPr>
+          <w:lang w:val="fr_FR" w:bidi="fr_FR"/>
+        </w:rPr>
+      </w:r>
+      <w:r>
+        <w:rPr>
+          <w:lang w:val="fr_FR" w:bidi="fr_FR"/>
+        </w:rPr>
+        <w:t xml:space="preserve">La Bible mentionne de nombreux projets de construction ou de reconstruction. Parfois, il s'agissait de construire ou bâtir quelque chose pour la première fois. D'autres fois, il fallait reconstruire ou réparer après des guerres ou l'abandon et la négligence d'édifices. Les constructions les plus fréquemment mentionnées sont celles d'autels, de sanctuaires, de maisons, de villes ou de temples. </w:t>
+      </w:r>
+    </w:p>
+    <w:p>
+      <w:pPr/>
+      <w:r>
+        <w:rPr>
+          <w:lang w:val="fr_FR" w:bidi="fr_FR"/>
+        </w:rPr>
+      </w:r>
+      <w:r>
+        <w:rPr>
+          <w:lang w:val="fr_FR" w:bidi="fr_FR"/>
+        </w:rPr>
+        <w:t>Le langage de construction est aussi utilisé comme métaphore. Dans le Nouveau Testament, il désigne ce que les chrétiens peuvent faire pour eux-mêmes et pour les autres, pour aider à la croissance ou l'encouragement dans la foi. Le verbe « édifier » est souvent utilisé dans ce sens.</w:t>
+      </w:r>
+    </w:p>
+    <w:p>
+      <w:pPr/>
+      <w:r>
+        <w:rPr>
+          <w:lang w:val="fr_FR" w:bidi="fr_FR"/>
+        </w:rPr>
+      </w:r>
+      <w:r>
+        <w:rPr>
+          <w:lang w:val="fr_FR" w:bidi="fr_FR"/>
+        </w:rPr>
+        <w:t>1 Pierre 2.4–8</w:t>
+      </w:r>
+      <w:r>
+        <w:rPr>
+          <w:lang w:val="fr_FR" w:bidi="fr_FR"/>
+        </w:rPr>
+        <w:t xml:space="preserve"> est une exhortation qui repose entièrement sur la représentation du peuple de Dieu comme édifice duquel Christ est la pierre principale. </w:t>
+      </w:r>
+    </w:p>
+    <w:p>
+      <w:pPr/>
+      <w:r>
+        <w:rPr>
+          <w:lang w:val="fr_FR" w:bidi="fr_FR"/>
+        </w:rPr>
+      </w:r>
+      <w:r>
+        <w:rPr>
+          <w:i/>
+          <w:lang w:val="fr_FR" w:bidi="fr_FR"/>
+        </w:rPr>
+        <w:t>Voir</w:t>
+      </w:r>
+      <w:r>
+        <w:rPr>
+          <w:lang w:val="fr_FR" w:bidi="fr_FR"/>
+        </w:rPr>
+        <w:t xml:space="preserve"> </w:t>
+      </w:r>
+      <w:r>
+        <w:rPr>
+          <w:lang w:val="fr_FR" w:bidi="fr_FR"/>
+        </w:rPr>
+        <w:t>architecture</w:t>
+      </w:r>
+      <w:r>
+        <w:rPr>
+          <w:lang w:val="fr_FR" w:bidi="fr_FR"/>
+        </w:rPr>
+        <w:t>.</w:t>
+      </w:r>
+      <w:r>
+        <w:rPr>
+          <w:lang w:val="fr_FR" w:bidi="fr_FR"/>
+        </w:rPr>
+      </w:r>
+      <w:r>
+        <w:rPr>
+          <w:lang w:val="fr_FR" w:bidi="fr_FR"/>
+        </w:rPr>
+      </w:r>
+    </w:p>
+    <w:p>
+      <w:pPr/>
+      <w:r>
+        <w:rPr>
+          <w:lang w:val="fr_FR" w:bidi="fr_FR"/>
+        </w:rPr>
+      </w:r>
+    </w:p>
+    <w:p>
+      <w:pPr>
+        <w:pStyle w:val="Heading2"/>
+      </w:pPr>
+      <w:r>
+        <w:rPr>
+          <w:lang w:val="fr_FR" w:bidi="fr_FR"/>
+        </w:rPr>
         <w:t>Batslith, Batsluth</w:t>
       </w:r>
       <w:r>
@@ -17192,6 +18354,54 @@
         <w:rPr>
           <w:lang w:val="fr_FR" w:bidi="fr_FR"/>
         </w:rPr>
+        <w:t>Bébaï (lieu)</w:t>
+      </w:r>
+      <w:r>
+        <w:rPr>
+          <w:lang w:val="fr_FR" w:bidi="fr_FR"/>
+        </w:rPr>
+      </w:r>
+    </w:p>
+    <w:p>
+      <w:pPr/>
+      <w:r>
+        <w:rPr>
+          <w:lang w:val="fr_FR" w:bidi="fr_FR"/>
+        </w:rPr>
+      </w:r>
+      <w:r>
+        <w:rPr>
+          <w:lang w:val="fr_FR" w:bidi="fr_FR"/>
+        </w:rPr>
+        <w:t>Ville israélite non identifiée, mentionnée dans Judith 15.4.</w:t>
+      </w:r>
+      <w:r>
+        <w:rPr>
+          <w:lang w:val="fr_FR" w:bidi="fr_FR"/>
+        </w:rPr>
+      </w:r>
+      <w:r>
+        <w:rPr>
+          <w:lang w:val="fr_FR" w:bidi="fr_FR"/>
+        </w:rPr>
+      </w:r>
+    </w:p>
+    <w:p>
+      <w:pPr/>
+      <w:r>
+        <w:rPr>
+          <w:lang w:val="fr_FR" w:bidi="fr_FR"/>
+        </w:rPr>
+      </w:r>
+    </w:p>
+    <w:p>
+      <w:pPr>
+        <w:pStyle w:val="Heading2"/>
+      </w:pPr>
+      <w:r>
+        <w:rPr>
+          <w:lang w:val="fr_FR" w:bidi="fr_FR"/>
+        </w:rPr>
         <w:t>Bébaï (Personne)</w:t>
       </w:r>
       <w:r>
@@ -19825,6 +21035,54 @@
         <w:rPr>
           <w:lang w:val="fr_FR" w:bidi="fr_FR"/>
         </w:rPr>
+        <w:t>Bektileth</w:t>
+      </w:r>
+      <w:r>
+        <w:rPr>
+          <w:lang w:val="fr_FR" w:bidi="fr_FR"/>
+        </w:rPr>
+      </w:r>
+    </w:p>
+    <w:p>
+      <w:pPr/>
+      <w:r>
+        <w:rPr>
+          <w:lang w:val="fr_FR" w:bidi="fr_FR"/>
+        </w:rPr>
+      </w:r>
+      <w:r>
+        <w:rPr>
+          <w:lang w:val="fr_FR" w:bidi="fr_FR"/>
+        </w:rPr>
+        <w:t>Plaine mentionnée uniquement dans les livres apocryphes. Holopherne, le général de Nabucadnetsar (Nabuchodonosor), y établit son camp lors de sa conquête vers l’ouest (Jdt 2.21–23).</w:t>
+      </w:r>
+      <w:r>
+        <w:rPr>
+          <w:lang w:val="fr_FR" w:bidi="fr_FR"/>
+        </w:rPr>
+      </w:r>
+      <w:r>
+        <w:rPr>
+          <w:lang w:val="fr_FR" w:bidi="fr_FR"/>
+        </w:rPr>
+      </w:r>
+    </w:p>
+    <w:p>
+      <w:pPr/>
+      <w:r>
+        <w:rPr>
+          <w:lang w:val="fr_FR" w:bidi="fr_FR"/>
+        </w:rPr>
+      </w:r>
+    </w:p>
+    <w:p>
+      <w:pPr>
+        <w:pStyle w:val="Heading2"/>
+      </w:pPr>
+      <w:r>
+        <w:rPr>
+          <w:lang w:val="fr_FR" w:bidi="fr_FR"/>
+        </w:rPr>
         <w:t>Bel</w:t>
       </w:r>
       <w:r>
@@ -19908,6 +21166,87 @@
           <w:lang w:val="fr_FR" w:bidi="fr_FR"/>
         </w:rPr>
         <w:t>Marduk</w:t>
+      </w:r>
+      <w:r>
+        <w:rPr>
+          <w:lang w:val="fr_FR" w:bidi="fr_FR"/>
+        </w:rPr>
+        <w:t>.</w:t>
+      </w:r>
+      <w:r>
+        <w:rPr>
+          <w:lang w:val="fr_FR" w:bidi="fr_FR"/>
+        </w:rPr>
+      </w:r>
+      <w:r>
+        <w:rPr>
+          <w:lang w:val="fr_FR" w:bidi="fr_FR"/>
+        </w:rPr>
+      </w:r>
+    </w:p>
+    <w:p>
+      <w:pPr/>
+      <w:r>
+        <w:rPr>
+          <w:lang w:val="fr_FR" w:bidi="fr_FR"/>
+        </w:rPr>
+      </w:r>
+    </w:p>
+    <w:p>
+      <w:pPr>
+        <w:pStyle w:val="Heading2"/>
+      </w:pPr>
+      <w:r>
+        <w:rPr>
+          <w:lang w:val="fr_FR" w:bidi="fr_FR"/>
+        </w:rPr>
+        <w:t>Bel et le dragon</w:t>
+      </w:r>
+      <w:r>
+        <w:rPr>
+          <w:lang w:val="fr_FR" w:bidi="fr_FR"/>
+        </w:rPr>
+      </w:r>
+    </w:p>
+    <w:p>
+      <w:pPr/>
+      <w:r>
+        <w:rPr>
+          <w:lang w:val="fr_FR" w:bidi="fr_FR"/>
+        </w:rPr>
+      </w:r>
+      <w:r>
+        <w:rPr>
+          <w:lang w:val="fr_FR" w:bidi="fr_FR"/>
+        </w:rPr>
+        <w:t>Récit religieux deutérocanonique inclus dans la Bible selon certaines traditions (catholique et orthodoxe). Dans ce récit, Daniel démontre que les dieux babyloniens ne sont pas réels.</w:t>
+      </w:r>
+    </w:p>
+    <w:p>
+      <w:pPr/>
+      <w:r>
+        <w:rPr>
+          <w:lang w:val="fr_FR" w:bidi="fr_FR"/>
+        </w:rPr>
+      </w:r>
+      <w:r>
+        <w:rPr>
+          <w:i/>
+          <w:lang w:val="fr_FR" w:bidi="fr_FR"/>
+        </w:rPr>
+        <w:t>Voir</w:t>
+      </w:r>
+      <w:r>
+        <w:rPr>
+          <w:lang w:val="fr_FR" w:bidi="fr_FR"/>
+        </w:rPr>
+        <w:t xml:space="preserve"> </w:t>
+      </w:r>
+      <w:r>
+        <w:rPr>
+          <w:lang w:val="fr_FR" w:bidi="fr_FR"/>
+        </w:rPr>
+        <w:t>Daniel, Additions à</w:t>
       </w:r>
       <w:r>
         <w:rPr>
@@ -20215,6 +21554,54 @@
         <w:rPr>
           <w:lang w:val="fr_FR" w:bidi="fr_FR"/>
         </w:rPr>
+        <w:t>Belbaïm</w:t>
+      </w:r>
+      <w:r>
+        <w:rPr>
+          <w:lang w:val="fr_FR" w:bidi="fr_FR"/>
+        </w:rPr>
+      </w:r>
+    </w:p>
+    <w:p>
+      <w:pPr/>
+      <w:r>
+        <w:rPr>
+          <w:lang w:val="fr_FR" w:bidi="fr_FR"/>
+        </w:rPr>
+      </w:r>
+      <w:r>
+        <w:rPr>
+          <w:lang w:val="fr_FR" w:bidi="fr_FR"/>
+        </w:rPr>
+        <w:t>Ville située au sud de Dothan. Elle est mentionnée dans le livre de Judith (Jdt 7.3). Il pourrait s’agir de la même ville que Abelmaïm (Jdt 4.4).</w:t>
+      </w:r>
+      <w:r>
+        <w:rPr>
+          <w:lang w:val="fr_FR" w:bidi="fr_FR"/>
+        </w:rPr>
+      </w:r>
+      <w:r>
+        <w:rPr>
+          <w:lang w:val="fr_FR" w:bidi="fr_FR"/>
+        </w:rPr>
+      </w:r>
+    </w:p>
+    <w:p>
+      <w:pPr/>
+      <w:r>
+        <w:rPr>
+          <w:lang w:val="fr_FR" w:bidi="fr_FR"/>
+        </w:rPr>
+      </w:r>
+    </w:p>
+    <w:p>
+      <w:pPr>
+        <w:pStyle w:val="Heading2"/>
+      </w:pPr>
+      <w:r>
+        <w:rPr>
+          <w:lang w:val="fr_FR" w:bidi="fr_FR"/>
+        </w:rPr>
         <w:t>Bélial, Beliar</w:t>
       </w:r>
       <w:r>
@@ -20445,6 +21832,87 @@
         <w:rPr>
           <w:lang w:val="fr_FR" w:bidi="fr_FR"/>
         </w:rPr>
+        <w:t>bélier (machine de guerre)</w:t>
+      </w:r>
+      <w:r>
+        <w:rPr>
+          <w:lang w:val="fr_FR" w:bidi="fr_FR"/>
+        </w:rPr>
+      </w:r>
+    </w:p>
+    <w:p>
+      <w:pPr/>
+      <w:r>
+        <w:rPr>
+          <w:lang w:val="fr_FR" w:bidi="fr_FR"/>
+        </w:rPr>
+      </w:r>
+      <w:r>
+        <w:rPr>
+          <w:lang w:val="fr_FR" w:bidi="fr_FR"/>
+        </w:rPr>
+        <w:t>Lourde poutre en bois dont on se servait pour défoncer les portes ou les murailles de défense d'une ville ou d'une forteresse. Le bout dont on se servait pour cogner était parfois en fer.</w:t>
+      </w:r>
+    </w:p>
+    <w:p>
+      <w:pPr/>
+      <w:r>
+        <w:rPr>
+          <w:lang w:val="fr_FR" w:bidi="fr_FR"/>
+        </w:rPr>
+      </w:r>
+      <w:r>
+        <w:rPr>
+          <w:i/>
+          <w:lang w:val="fr_FR" w:bidi="fr_FR"/>
+        </w:rPr>
+        <w:t>Voir</w:t>
+      </w:r>
+      <w:r>
+        <w:rPr>
+          <w:lang w:val="fr_FR" w:bidi="fr_FR"/>
+        </w:rPr>
+        <w:t xml:space="preserve"> </w:t>
+      </w:r>
+      <w:r>
+        <w:rPr>
+          <w:lang w:val="fr_FR" w:bidi="fr_FR"/>
+        </w:rPr>
+        <w:t>armures et armes</w:t>
+      </w:r>
+      <w:r>
+        <w:rPr>
+          <w:lang w:val="fr_FR" w:bidi="fr_FR"/>
+        </w:rPr>
+        <w:t>.</w:t>
+      </w:r>
+      <w:r>
+        <w:rPr>
+          <w:lang w:val="fr_FR" w:bidi="fr_FR"/>
+        </w:rPr>
+      </w:r>
+      <w:r>
+        <w:rPr>
+          <w:lang w:val="fr_FR" w:bidi="fr_FR"/>
+        </w:rPr>
+      </w:r>
+    </w:p>
+    <w:p>
+      <w:pPr/>
+      <w:r>
+        <w:rPr>
+          <w:lang w:val="fr_FR" w:bidi="fr_FR"/>
+        </w:rPr>
+      </w:r>
+    </w:p>
+    <w:p>
+      <w:pPr>
+        <w:pStyle w:val="Heading2"/>
+      </w:pPr>
+      <w:r>
+        <w:rPr>
+          <w:lang w:val="fr_FR" w:bidi="fr_FR"/>
+        </w:rPr>
         <w:t>Belle Porte</w:t>
       </w:r>
       <w:r>
@@ -20679,6 +22147,111 @@
           <w:lang w:val="fr_FR" w:bidi="fr_FR"/>
         </w:rPr>
         <w:t>Babylone, Babylonie</w:t>
+      </w:r>
+      <w:r>
+        <w:rPr>
+          <w:lang w:val="fr_FR" w:bidi="fr_FR"/>
+        </w:rPr>
+        <w:t>.</w:t>
+      </w:r>
+      <w:r>
+        <w:rPr>
+          <w:lang w:val="fr_FR" w:bidi="fr_FR"/>
+        </w:rPr>
+      </w:r>
+      <w:r>
+        <w:rPr>
+          <w:lang w:val="fr_FR" w:bidi="fr_FR"/>
+        </w:rPr>
+      </w:r>
+    </w:p>
+    <w:p>
+      <w:pPr/>
+      <w:r>
+        <w:rPr>
+          <w:lang w:val="fr_FR" w:bidi="fr_FR"/>
+        </w:rPr>
+      </w:r>
+    </w:p>
+    <w:p>
+      <w:pPr>
+        <w:pStyle w:val="Heading2"/>
+      </w:pPr>
+      <w:r>
+        <w:rPr>
+          <w:lang w:val="fr_FR" w:bidi="fr_FR"/>
+        </w:rPr>
+        <w:t>Beltschatsar</w:t>
+      </w:r>
+      <w:r>
+        <w:rPr>
+          <w:lang w:val="fr_FR" w:bidi="fr_FR"/>
+        </w:rPr>
+      </w:r>
+    </w:p>
+    <w:p>
+      <w:pPr/>
+      <w:r>
+        <w:rPr>
+          <w:lang w:val="fr_FR" w:bidi="fr_FR"/>
+        </w:rPr>
+      </w:r>
+      <w:r>
+        <w:rPr>
+          <w:lang w:val="fr_FR" w:bidi="fr_FR"/>
+        </w:rPr>
+        <w:t>Nom babylonien donné à Daniel (</w:t>
+      </w:r>
+      <w:r>
+        <w:rPr>
+          <w:lang w:val="fr_FR" w:bidi="fr_FR"/>
+        </w:rPr>
+        <w:t>Dn 1.7</w:t>
+      </w:r>
+      <w:r>
+        <w:rPr>
+          <w:lang w:val="fr_FR" w:bidi="fr_FR"/>
+        </w:rPr>
+        <w:t>). Daniel fait partie des jeunes hommes emmenés en captivité à Babylone pour être formés en vue de servir le roi Nebucadnetsar (</w:t>
+      </w:r>
+      <w:r>
+        <w:rPr>
+          <w:lang w:val="fr_FR" w:bidi="fr_FR"/>
+        </w:rPr>
+        <w:t>Daniel 1</w:t>
+      </w:r>
+      <w:r>
+        <w:rPr>
+          <w:lang w:val="fr_FR" w:bidi="fr_FR"/>
+        </w:rPr>
+        <w:t>).</w:t>
+      </w:r>
+    </w:p>
+    <w:p>
+      <w:pPr/>
+      <w:r>
+        <w:rPr>
+          <w:lang w:val="fr_FR" w:bidi="fr_FR"/>
+        </w:rPr>
+      </w:r>
+      <w:r>
+        <w:rPr>
+          <w:i/>
+          <w:lang w:val="fr_FR" w:bidi="fr_FR"/>
+        </w:rPr>
+        <w:t>Voir</w:t>
+      </w:r>
+      <w:r>
+        <w:rPr>
+          <w:lang w:val="fr_FR" w:bidi="fr_FR"/>
+        </w:rPr>
+        <w:t xml:space="preserve"> </w:t>
+      </w:r>
+      <w:r>
+        <w:rPr>
+          <w:lang w:val="fr_FR" w:bidi="fr_FR"/>
+        </w:rPr>
+        <w:t>Daniel (personne) n° 3</w:t>
       </w:r>
       <w:r>
         <w:rPr>
@@ -21054,6 +22627,112 @@
         <w:rPr>
           <w:lang w:val="fr_FR" w:bidi="fr_FR"/>
         </w:rPr>
+        <w:t>Ben (nom)</w:t>
+      </w:r>
+      <w:r>
+        <w:rPr>
+          <w:lang w:val="fr_FR" w:bidi="fr_FR"/>
+        </w:rPr>
+      </w:r>
+    </w:p>
+    <w:p>
+      <w:pPr/>
+      <w:r>
+        <w:rPr>
+          <w:lang w:val="fr_FR" w:bidi="fr_FR"/>
+        </w:rPr>
+      </w:r>
+      <w:r>
+        <w:rPr>
+          <w:lang w:val="fr_FR" w:bidi="fr_FR"/>
+        </w:rPr>
+        <w:t xml:space="preserve">Mot hébreu utilisé au début des noms pour exprimer une relation. Ce mot signifie littéralement « fils ». Il apparaît 4 850 fois dans l’Ancien Testament. En araméen, il se dit </w:t>
+      </w:r>
+      <w:r>
+        <w:rPr>
+          <w:i/>
+          <w:lang w:val="fr_FR" w:bidi="fr_FR"/>
+        </w:rPr>
+        <w:t xml:space="preserve">bar. </w:t>
+      </w:r>
+      <w:r>
+        <w:rPr>
+          <w:lang w:val="fr_FR" w:bidi="fr_FR"/>
+        </w:rPr>
+        <w:t xml:space="preserve">Par exemple, dans </w:t>
+      </w:r>
+      <w:r>
+        <w:rPr>
+          <w:lang w:val="fr_FR" w:bidi="fr_FR"/>
+        </w:rPr>
+        <w:t>Matthieu 16.17</w:t>
+      </w:r>
+      <w:r>
+        <w:rPr>
+          <w:lang w:val="fr_FR" w:bidi="fr_FR"/>
+        </w:rPr>
+        <w:t xml:space="preserve"> le nom traduit « fils de Jonas » est littéralement Bar-Jona[s].</w:t>
+      </w:r>
+    </w:p>
+    <w:p>
+      <w:pPr/>
+      <w:r>
+        <w:rPr>
+          <w:lang w:val="fr_FR" w:bidi="fr_FR"/>
+        </w:rPr>
+      </w:r>
+      <w:r>
+        <w:rPr>
+          <w:i/>
+          <w:lang w:val="fr_FR" w:bidi="fr_FR"/>
+        </w:rPr>
+        <w:t>Voir aussi</w:t>
+      </w:r>
+      <w:r>
+        <w:rPr>
+          <w:lang w:val="fr_FR" w:bidi="fr_FR"/>
+        </w:rPr>
+        <w:t xml:space="preserve"> </w:t>
+      </w:r>
+      <w:r>
+        <w:rPr>
+          <w:lang w:val="fr_FR" w:bidi="fr_FR"/>
+        </w:rPr>
+        <w:t>Bar</w:t>
+      </w:r>
+      <w:r>
+        <w:rPr>
+          <w:lang w:val="fr_FR" w:bidi="fr_FR"/>
+        </w:rPr>
+        <w:t>.</w:t>
+      </w:r>
+      <w:r>
+        <w:rPr>
+          <w:lang w:val="fr_FR" w:bidi="fr_FR"/>
+        </w:rPr>
+      </w:r>
+      <w:r>
+        <w:rPr>
+          <w:lang w:val="fr_FR" w:bidi="fr_FR"/>
+        </w:rPr>
+      </w:r>
+    </w:p>
+    <w:p>
+      <w:pPr/>
+      <w:r>
+        <w:rPr>
+          <w:lang w:val="fr_FR" w:bidi="fr_FR"/>
+        </w:rPr>
+      </w:r>
+    </w:p>
+    <w:p>
+      <w:pPr>
+        <w:pStyle w:val="Heading2"/>
+      </w:pPr>
+      <w:r>
+        <w:rPr>
+          <w:lang w:val="fr_FR" w:bidi="fr_FR"/>
+        </w:rPr>
         <w:t>Ben (Personne)</w:t>
       </w:r>
       <w:r>
@@ -21122,6 +22801,94 @@
           <w:lang w:val="fr_FR" w:bidi="fr_FR"/>
         </w:rPr>
         <w:t xml:space="preserve"> peut être une erreur de copiste.</w:t>
+      </w:r>
+      <w:r>
+        <w:rPr>
+          <w:lang w:val="fr_FR" w:bidi="fr_FR"/>
+        </w:rPr>
+      </w:r>
+      <w:r>
+        <w:rPr>
+          <w:lang w:val="fr_FR" w:bidi="fr_FR"/>
+        </w:rPr>
+      </w:r>
+    </w:p>
+    <w:p>
+      <w:pPr/>
+      <w:r>
+        <w:rPr>
+          <w:lang w:val="fr_FR" w:bidi="fr_FR"/>
+        </w:rPr>
+      </w:r>
+    </w:p>
+    <w:p>
+      <w:pPr>
+        <w:pStyle w:val="Heading2"/>
+      </w:pPr>
+      <w:r>
+        <w:rPr>
+          <w:lang w:val="fr_FR" w:bidi="fr_FR"/>
+        </w:rPr>
+        <w:t>Ben Sira, Jésus</w:t>
+      </w:r>
+      <w:r>
+        <w:rPr>
+          <w:lang w:val="fr_FR" w:bidi="fr_FR"/>
+        </w:rPr>
+      </w:r>
+    </w:p>
+    <w:p>
+      <w:pPr/>
+      <w:r>
+        <w:rPr>
+          <w:lang w:val="fr_FR" w:bidi="fr_FR"/>
+        </w:rPr>
+      </w:r>
+      <w:r>
+        <w:rPr>
+          <w:lang w:val="fr_FR" w:bidi="fr_FR"/>
+        </w:rPr>
+        <w:t>Jésus, fils de Sira, est l'auteur du Siracide (livre également connu sous le nom d’</w:t>
+      </w:r>
+      <w:r>
+        <w:rPr>
+          <w:i/>
+          <w:lang w:val="fr_FR" w:bidi="fr_FR"/>
+        </w:rPr>
+        <w:t>Ecclésiastique</w:t>
+      </w:r>
+      <w:r>
+        <w:rPr>
+          <w:lang w:val="fr_FR" w:bidi="fr_FR"/>
+        </w:rPr>
+        <w:t>).</w:t>
+      </w:r>
+    </w:p>
+    <w:p>
+      <w:pPr/>
+      <w:r>
+        <w:rPr>
+          <w:lang w:val="fr_FR" w:bidi="fr_FR"/>
+        </w:rPr>
+      </w:r>
+      <w:r>
+        <w:rPr>
+          <w:i/>
+          <w:lang w:val="fr_FR" w:bidi="fr_FR"/>
+        </w:rPr>
+        <w:t>Voir</w:t>
+      </w:r>
+      <w:r>
+        <w:rPr>
+          <w:lang w:val="fr_FR" w:bidi="fr_FR"/>
+        </w:rPr>
+        <w:t xml:space="preserve"> </w:t>
+      </w:r>
+      <w:r>
+        <w:rPr>
+          <w:lang w:val="fr_FR" w:bidi="fr_FR"/>
+        </w:rPr>
+        <w:t>Siracide</w:t>
       </w:r>
       <w:r>
         <w:rPr>
@@ -25000,6 +26767,87 @@
         <w:rPr>
           <w:lang w:val="fr_FR" w:bidi="fr_FR"/>
         </w:rPr>
+        <w:t>Benjamite</w:t>
+      </w:r>
+      <w:r>
+        <w:rPr>
+          <w:lang w:val="fr_FR" w:bidi="fr_FR"/>
+        </w:rPr>
+      </w:r>
+    </w:p>
+    <w:p>
+      <w:pPr/>
+      <w:r>
+        <w:rPr>
+          <w:lang w:val="fr_FR" w:bidi="fr_FR"/>
+        </w:rPr>
+      </w:r>
+      <w:r>
+        <w:rPr>
+          <w:lang w:val="fr_FR" w:bidi="fr_FR"/>
+        </w:rPr>
+        <w:t>Membre de la tribu de Benjamin.</w:t>
+      </w:r>
+    </w:p>
+    <w:p>
+      <w:pPr/>
+      <w:r>
+        <w:rPr>
+          <w:lang w:val="fr_FR" w:bidi="fr_FR"/>
+        </w:rPr>
+      </w:r>
+      <w:r>
+        <w:rPr>
+          <w:i/>
+          <w:lang w:val="fr_FR" w:bidi="fr_FR"/>
+        </w:rPr>
+        <w:t>Voir</w:t>
+      </w:r>
+      <w:r>
+        <w:rPr>
+          <w:lang w:val="fr_FR" w:bidi="fr_FR"/>
+        </w:rPr>
+        <w:t xml:space="preserve"> </w:t>
+      </w:r>
+      <w:r>
+        <w:rPr>
+          <w:lang w:val="fr_FR" w:bidi="fr_FR"/>
+        </w:rPr>
+        <w:t>Benjamin, tribu de</w:t>
+      </w:r>
+      <w:r>
+        <w:rPr>
+          <w:lang w:val="fr_FR" w:bidi="fr_FR"/>
+        </w:rPr>
+        <w:t>.</w:t>
+      </w:r>
+      <w:r>
+        <w:rPr>
+          <w:lang w:val="fr_FR" w:bidi="fr_FR"/>
+        </w:rPr>
+      </w:r>
+      <w:r>
+        <w:rPr>
+          <w:lang w:val="fr_FR" w:bidi="fr_FR"/>
+        </w:rPr>
+      </w:r>
+    </w:p>
+    <w:p>
+      <w:pPr/>
+      <w:r>
+        <w:rPr>
+          <w:lang w:val="fr_FR" w:bidi="fr_FR"/>
+        </w:rPr>
+      </w:r>
+    </w:p>
+    <w:p>
+      <w:pPr>
+        <w:pStyle w:val="Heading2"/>
+      </w:pPr>
+      <w:r>
+        <w:rPr>
+          <w:lang w:val="fr_FR" w:bidi="fr_FR"/>
+        </w:rPr>
         <w:t>Beno</w:t>
       </w:r>
       <w:r>
@@ -29585,6 +31433,112 @@
         <w:rPr>
           <w:lang w:val="fr_FR" w:bidi="fr_FR"/>
         </w:rPr>
+        <w:t>Bethabara</w:t>
+      </w:r>
+      <w:r>
+        <w:rPr>
+          <w:lang w:val="fr_FR" w:bidi="fr_FR"/>
+        </w:rPr>
+      </w:r>
+    </w:p>
+    <w:p>
+      <w:pPr/>
+      <w:r>
+        <w:rPr>
+          <w:lang w:val="fr_FR" w:bidi="fr_FR"/>
+        </w:rPr>
+      </w:r>
+      <w:r>
+        <w:rPr>
+          <w:lang w:val="fr_FR" w:bidi="fr_FR"/>
+        </w:rPr>
+        <w:t>Selon certains manuscrits anciens, Bethabara est le nom du village où les messagers des pharisiens interrogent Jean le Baptiste (</w:t>
+      </w:r>
+      <w:r>
+        <w:rPr>
+          <w:lang w:val="fr_FR" w:bidi="fr_FR"/>
+        </w:rPr>
+        <w:t>Jn 1.28</w:t>
+      </w:r>
+      <w:r>
+        <w:rPr>
+          <w:lang w:val="fr_FR" w:bidi="fr_FR"/>
+        </w:rPr>
+        <w:t>). Cependant, les manuscrits plus fiables appellent ce village « Béthanie ». Jean l’appelle Béthanie « au-delà du Jourdain » pour la distinguer de l'autre Béthanie, qui se trouve près de Jérusalem.</w:t>
+      </w:r>
+    </w:p>
+    <w:p>
+      <w:pPr/>
+      <w:r>
+        <w:rPr>
+          <w:lang w:val="fr_FR" w:bidi="fr_FR"/>
+        </w:rPr>
+      </w:r>
+      <w:r>
+        <w:rPr>
+          <w:i/>
+          <w:lang w:val="fr_FR" w:bidi="fr_FR"/>
+        </w:rPr>
+        <w:t>Voir</w:t>
+      </w:r>
+      <w:r>
+        <w:rPr>
+          <w:lang w:val="fr_FR" w:bidi="fr_FR"/>
+        </w:rPr>
+        <w:t xml:space="preserve"> </w:t>
+      </w:r>
+      <w:r>
+        <w:rPr>
+          <w:lang w:val="fr_FR" w:bidi="fr_FR"/>
+        </w:rPr>
+        <w:t>Béthanie n</w:t>
+      </w:r>
+      <w:r>
+        <w:rPr>
+          <w:vertAlign w:val="superscript"/>
+          <w:lang w:val="fr_FR" w:bidi="fr_FR"/>
+        </w:rPr>
+        <w:t>o</w:t>
+      </w:r>
+      <w:r>
+        <w:rPr>
+          <w:lang w:val="fr_FR" w:bidi="fr_FR"/>
+        </w:rPr>
+        <w:t xml:space="preserve"> 2</w:t>
+      </w:r>
+      <w:r>
+        <w:rPr>
+          <w:lang w:val="fr_FR" w:bidi="fr_FR"/>
+        </w:rPr>
+        <w:t>.</w:t>
+      </w:r>
+      <w:r>
+        <w:rPr>
+          <w:lang w:val="fr_FR" w:bidi="fr_FR"/>
+        </w:rPr>
+      </w:r>
+      <w:r>
+        <w:rPr>
+          <w:lang w:val="fr_FR" w:bidi="fr_FR"/>
+        </w:rPr>
+      </w:r>
+    </w:p>
+    <w:p>
+      <w:pPr/>
+      <w:r>
+        <w:rPr>
+          <w:lang w:val="fr_FR" w:bidi="fr_FR"/>
+        </w:rPr>
+      </w:r>
+    </w:p>
+    <w:p>
+      <w:pPr>
+        <w:pStyle w:val="Heading2"/>
+      </w:pPr>
+      <w:r>
+        <w:rPr>
+          <w:lang w:val="fr_FR" w:bidi="fr_FR"/>
+        </w:rPr>
         <w:t>Béthach</w:t>
       </w:r>
       <w:r>
@@ -30074,6 +32028,80 @@
           <w:lang w:val="fr_FR" w:bidi="fr_FR"/>
         </w:rPr>
         <w:t>). L'actuel Aïn Gharbeh dans le Wadi el-Quelt pourrait être le site de Beth-Araba.</w:t>
+      </w:r>
+      <w:r>
+        <w:rPr>
+          <w:lang w:val="fr_FR" w:bidi="fr_FR"/>
+        </w:rPr>
+      </w:r>
+      <w:r>
+        <w:rPr>
+          <w:lang w:val="fr_FR" w:bidi="fr_FR"/>
+        </w:rPr>
+      </w:r>
+    </w:p>
+    <w:p>
+      <w:pPr/>
+      <w:r>
+        <w:rPr>
+          <w:lang w:val="fr_FR" w:bidi="fr_FR"/>
+        </w:rPr>
+      </w:r>
+    </w:p>
+    <w:p>
+      <w:pPr>
+        <w:pStyle w:val="Heading2"/>
+      </w:pPr>
+      <w:r>
+        <w:rPr>
+          <w:lang w:val="fr_FR" w:bidi="fr_FR"/>
+        </w:rPr>
+        <w:t>Beth-Arbel</w:t>
+      </w:r>
+      <w:r>
+        <w:rPr>
+          <w:lang w:val="fr_FR" w:bidi="fr_FR"/>
+        </w:rPr>
+      </w:r>
+    </w:p>
+    <w:p>
+      <w:pPr/>
+      <w:r>
+        <w:rPr>
+          <w:lang w:val="fr_FR" w:bidi="fr_FR"/>
+        </w:rPr>
+      </w:r>
+      <w:r>
+        <w:rPr>
+          <w:lang w:val="fr_FR" w:bidi="fr_FR"/>
+        </w:rPr>
+        <w:t>Ville dont la destruction violente par les Assyriens est comparée par Osée à la destruction d’Éphraïm qui est alors encore à venir (</w:t>
+      </w:r>
+      <w:r>
+        <w:rPr>
+          <w:lang w:val="fr_FR" w:bidi="fr_FR"/>
+        </w:rPr>
+        <w:t>Os 10.14</w:t>
+      </w:r>
+      <w:r>
+        <w:rPr>
+          <w:lang w:val="fr_FR" w:bidi="fr_FR"/>
+        </w:rPr>
+        <w:t>).</w:t>
+      </w:r>
+    </w:p>
+    <w:p>
+      <w:pPr/>
+      <w:r>
+        <w:rPr>
+          <w:lang w:val="fr_FR" w:bidi="fr_FR"/>
+        </w:rPr>
+      </w:r>
+      <w:r>
+        <w:rPr>
+          <w:lang w:val="fr_FR" w:bidi="fr_FR"/>
+        </w:rPr>
+        <w:t>Beth-Arbel correspond probablement à l’actuelle Irbid, en Galaad, qui est située à une intersection importante au nord de la Transjordanie.</w:t>
       </w:r>
       <w:r>
         <w:rPr>
@@ -30532,6 +32560,66 @@
         <w:rPr>
           <w:lang w:val="fr_FR" w:bidi="fr_FR"/>
         </w:rPr>
+        <w:t>Bethbasi</w:t>
+      </w:r>
+      <w:r>
+        <w:rPr>
+          <w:lang w:val="fr_FR" w:bidi="fr_FR"/>
+        </w:rPr>
+      </w:r>
+    </w:p>
+    <w:p>
+      <w:pPr/>
+      <w:r>
+        <w:rPr>
+          <w:lang w:val="fr_FR" w:bidi="fr_FR"/>
+        </w:rPr>
+      </w:r>
+      <w:r>
+        <w:rPr>
+          <w:lang w:val="fr_FR" w:bidi="fr_FR"/>
+        </w:rPr>
+        <w:t xml:space="preserve">Ville du désert judéen qui sert de refuge à Jonathan et à Simon Maccabée. Ils s’y cachent du général </w:t>
+      </w:r>
+      <w:r>
+        <w:rPr>
+          <w:lang w:val="fr_FR" w:bidi="fr_FR"/>
+        </w:rPr>
+        <w:t>Bakkhidès</w:t>
+      </w:r>
+      <w:r>
+        <w:rPr>
+          <w:lang w:val="fr_FR" w:bidi="fr_FR"/>
+        </w:rPr>
+        <w:t>. Ils la fortifient et infligent une défaite à la force d'assaut syrienne (1 M 9.62–68). Suite à cette défaite, Bakkhidès accepte de faire la paix avec Jonathan (1 M 9.69–73).</w:t>
+      </w:r>
+      <w:r>
+        <w:rPr>
+          <w:lang w:val="fr_FR" w:bidi="fr_FR"/>
+        </w:rPr>
+      </w:r>
+      <w:r>
+        <w:rPr>
+          <w:lang w:val="fr_FR" w:bidi="fr_FR"/>
+        </w:rPr>
+      </w:r>
+    </w:p>
+    <w:p>
+      <w:pPr/>
+      <w:r>
+        <w:rPr>
+          <w:lang w:val="fr_FR" w:bidi="fr_FR"/>
+        </w:rPr>
+      </w:r>
+    </w:p>
+    <w:p>
+      <w:pPr>
+        <w:pStyle w:val="Heading2"/>
+      </w:pPr>
+      <w:r>
+        <w:rPr>
+          <w:lang w:val="fr_FR" w:bidi="fr_FR"/>
+        </w:rPr>
         <w:t>Beth-Bireï</w:t>
       </w:r>
       <w:r>
@@ -32282,6 +34370,66 @@
         <w:rPr>
           <w:lang w:val="fr_FR" w:bidi="fr_FR"/>
         </w:rPr>
+        <w:t>Beth-Haëtsel</w:t>
+      </w:r>
+      <w:r>
+        <w:rPr>
+          <w:lang w:val="fr_FR" w:bidi="fr_FR"/>
+        </w:rPr>
+      </w:r>
+    </w:p>
+    <w:p>
+      <w:pPr/>
+      <w:r>
+        <w:rPr>
+          <w:lang w:val="fr_FR" w:bidi="fr_FR"/>
+        </w:rPr>
+      </w:r>
+      <w:r>
+        <w:rPr>
+          <w:lang w:val="fr_FR" w:bidi="fr_FR"/>
+        </w:rPr>
+        <w:t>Une des nombreuses petites villes probablement situées dans le sud-ouest de Juda, dont le prophète Michée déplore la destruction (</w:t>
+      </w:r>
+      <w:r>
+        <w:rPr>
+          <w:lang w:val="fr_FR" w:bidi="fr_FR"/>
+        </w:rPr>
+        <w:t>Mi 1.11</w:t>
+      </w:r>
+      <w:r>
+        <w:rPr>
+          <w:lang w:val="fr_FR" w:bidi="fr_FR"/>
+        </w:rPr>
+        <w:t>).</w:t>
+      </w:r>
+      <w:r>
+        <w:rPr>
+          <w:lang w:val="fr_FR" w:bidi="fr_FR"/>
+        </w:rPr>
+      </w:r>
+      <w:r>
+        <w:rPr>
+          <w:lang w:val="fr_FR" w:bidi="fr_FR"/>
+        </w:rPr>
+      </w:r>
+    </w:p>
+    <w:p>
+      <w:pPr/>
+      <w:r>
+        <w:rPr>
+          <w:lang w:val="fr_FR" w:bidi="fr_FR"/>
+        </w:rPr>
+      </w:r>
+    </w:p>
+    <w:p>
+      <w:pPr>
+        <w:pStyle w:val="Heading2"/>
+      </w:pPr>
+      <w:r>
+        <w:rPr>
+          <w:lang w:val="fr_FR" w:bidi="fr_FR"/>
+        </w:rPr>
         <w:t>Beth-Haggan</w:t>
       </w:r>
       <w:r>
@@ -32857,6 +35005,66 @@
           <w:lang w:val="fr_FR" w:bidi="fr_FR"/>
         </w:rPr>
         <w:t>.</w:t>
+      </w:r>
+      <w:r>
+        <w:rPr>
+          <w:lang w:val="fr_FR" w:bidi="fr_FR"/>
+        </w:rPr>
+      </w:r>
+      <w:r>
+        <w:rPr>
+          <w:lang w:val="fr_FR" w:bidi="fr_FR"/>
+        </w:rPr>
+      </w:r>
+    </w:p>
+    <w:p>
+      <w:pPr/>
+      <w:r>
+        <w:rPr>
+          <w:lang w:val="fr_FR" w:bidi="fr_FR"/>
+        </w:rPr>
+      </w:r>
+    </w:p>
+    <w:p>
+      <w:pPr>
+        <w:pStyle w:val="Heading2"/>
+      </w:pPr>
+      <w:r>
+        <w:rPr>
+          <w:lang w:val="fr_FR" w:bidi="fr_FR"/>
+        </w:rPr>
+        <w:t>Beth-Leaphra</w:t>
+      </w:r>
+      <w:r>
+        <w:rPr>
+          <w:lang w:val="fr_FR" w:bidi="fr_FR"/>
+        </w:rPr>
+      </w:r>
+    </w:p>
+    <w:p>
+      <w:pPr/>
+      <w:r>
+        <w:rPr>
+          <w:lang w:val="fr_FR" w:bidi="fr_FR"/>
+        </w:rPr>
+      </w:r>
+      <w:r>
+        <w:rPr>
+          <w:lang w:val="fr_FR" w:bidi="fr_FR"/>
+        </w:rPr>
+        <w:t>Ville mentionnée par le prophète Michée. Beth-Leaphra signifie « maison de poussière ». Le prophète utilise la signification du nom de cette ville pour faire un jeu de mots quand il annonce leur invasion future en disant « Je me roule dans la poussière à Beth-Leaphra » (</w:t>
+      </w:r>
+      <w:r>
+        <w:rPr>
+          <w:lang w:val="fr_FR" w:bidi="fr_FR"/>
+        </w:rPr>
+        <w:t>Mi 1.10</w:t>
+      </w:r>
+      <w:r>
+        <w:rPr>
+          <w:lang w:val="fr_FR" w:bidi="fr_FR"/>
+        </w:rPr>
+        <w:t>).</w:t>
       </w:r>
       <w:r>
         <w:rPr>
@@ -33878,6 +36086,68 @@
         <w:rPr>
           <w:lang w:val="fr_FR" w:bidi="fr_FR"/>
         </w:rPr>
+        <w:t>Béthomestaïm</w:t>
+      </w:r>
+      <w:r>
+        <w:rPr>
+          <w:lang w:val="fr_FR" w:bidi="fr_FR"/>
+        </w:rPr>
+      </w:r>
+    </w:p>
+    <w:p>
+      <w:pPr/>
+      <w:r>
+        <w:rPr>
+          <w:lang w:val="fr_FR" w:bidi="fr_FR"/>
+        </w:rPr>
+      </w:r>
+      <w:r>
+        <w:rPr>
+          <w:lang w:val="fr_FR" w:bidi="fr_FR"/>
+        </w:rPr>
+        <w:t>Lieu mentionné dans le livre de Judith. Ce livre le situe près de Dothan, mais son emplacement exact est inconnu aujourd'hui.</w:t>
+      </w:r>
+    </w:p>
+    <w:p>
+      <w:pPr/>
+      <w:r>
+        <w:rPr>
+          <w:lang w:val="fr_FR" w:bidi="fr_FR"/>
+        </w:rPr>
+      </w:r>
+      <w:r>
+        <w:rPr>
+          <w:lang w:val="fr_FR" w:bidi="fr_FR"/>
+        </w:rPr>
+        <w:t>Le souverain sacrificateur demande aux habitants de Béthomestaïm et de Béthulie de barrer la route à l’armée assyrienne qui avance sous la conduite d’Holopherne. Après la mort d’Holopherne, Betomasthaïm est l’une des villes auxquelles Ozias, chef de Béthulie, demande de détruire les restes de l’armée assyrienne (Jd 4.6–7 ; 15.4).</w:t>
+      </w:r>
+      <w:r>
+        <w:rPr>
+          <w:lang w:val="fr_FR" w:bidi="fr_FR"/>
+        </w:rPr>
+      </w:r>
+      <w:r>
+        <w:rPr>
+          <w:lang w:val="fr_FR" w:bidi="fr_FR"/>
+        </w:rPr>
+      </w:r>
+    </w:p>
+    <w:p>
+      <w:pPr/>
+      <w:r>
+        <w:rPr>
+          <w:lang w:val="fr_FR" w:bidi="fr_FR"/>
+        </w:rPr>
+      </w:r>
+    </w:p>
+    <w:p>
+      <w:pPr>
+        <w:pStyle w:val="Heading2"/>
+      </w:pPr>
+      <w:r>
+        <w:rPr>
+          <w:lang w:val="fr_FR" w:bidi="fr_FR"/>
+        </w:rPr>
         <w:t>Bethonim</w:t>
       </w:r>
       <w:r>
@@ -35887,6 +38157,243 @@
         <w:rPr>
           <w:lang w:val="fr_FR" w:bidi="fr_FR"/>
         </w:rPr>
+        <w:t>Béthulie</w:t>
+      </w:r>
+      <w:r>
+        <w:rPr>
+          <w:lang w:val="fr_FR" w:bidi="fr_FR"/>
+        </w:rPr>
+      </w:r>
+    </w:p>
+    <w:p>
+      <w:pPr/>
+      <w:r>
+        <w:rPr>
+          <w:lang w:val="fr_FR" w:bidi="fr_FR"/>
+        </w:rPr>
+      </w:r>
+      <w:r>
+        <w:rPr>
+          <w:lang w:val="fr_FR" w:bidi="fr_FR"/>
+        </w:rPr>
+        <w:t>Ville située près de Dothan, sur une colline dominant la plaine d’Esdrelôn. Béthulie et Esdrelôn sont mentionnées dans le livre de Judith (Jdt 4.6 ; 6.11). Holopherne, général de Nabucadnetsar, tente de forcer Béthulie à se soumettre en prenant contrôle des sources qui l'approvisionnent en eau (Jdt 7.6–7).</w:t>
+      </w:r>
+      <w:r>
+        <w:rPr>
+          <w:lang w:val="fr_FR" w:bidi="fr_FR"/>
+        </w:rPr>
+      </w:r>
+      <w:r>
+        <w:rPr>
+          <w:lang w:val="fr_FR" w:bidi="fr_FR"/>
+        </w:rPr>
+      </w:r>
+    </w:p>
+    <w:p>
+      <w:pPr/>
+      <w:r>
+        <w:rPr>
+          <w:lang w:val="fr_FR" w:bidi="fr_FR"/>
+        </w:rPr>
+      </w:r>
+    </w:p>
+    <w:p>
+      <w:pPr>
+        <w:pStyle w:val="Heading2"/>
+      </w:pPr>
+      <w:r>
+        <w:rPr>
+          <w:lang w:val="fr_FR" w:bidi="fr_FR"/>
+        </w:rPr>
+        <w:t>Bethzakharia</w:t>
+      </w:r>
+      <w:r>
+        <w:rPr>
+          <w:lang w:val="fr_FR" w:bidi="fr_FR"/>
+        </w:rPr>
+      </w:r>
+    </w:p>
+    <w:p>
+      <w:pPr/>
+      <w:r>
+        <w:rPr>
+          <w:lang w:val="fr_FR" w:bidi="fr_FR"/>
+        </w:rPr>
+      </w:r>
+      <w:r>
+        <w:rPr>
+          <w:lang w:val="fr_FR" w:bidi="fr_FR"/>
+        </w:rPr>
+        <w:t>Lieu situé à 16 kilomètres au sud-ouest de Jérusalem, où Judas Maccabée est vaincu par le souverain séleucide Antiochus V Eupator, fils d’Antiochus Épiphane (1 M 6.32–47).</w:t>
+      </w:r>
+      <w:r>
+        <w:rPr>
+          <w:lang w:val="fr_FR" w:bidi="fr_FR"/>
+        </w:rPr>
+      </w:r>
+      <w:r>
+        <w:rPr>
+          <w:lang w:val="fr_FR" w:bidi="fr_FR"/>
+        </w:rPr>
+      </w:r>
+    </w:p>
+    <w:p>
+      <w:pPr/>
+      <w:r>
+        <w:rPr>
+          <w:lang w:val="fr_FR" w:bidi="fr_FR"/>
+        </w:rPr>
+      </w:r>
+    </w:p>
+    <w:p>
+      <w:pPr>
+        <w:pStyle w:val="Heading2"/>
+      </w:pPr>
+      <w:r>
+        <w:rPr>
+          <w:lang w:val="fr_FR" w:bidi="fr_FR"/>
+        </w:rPr>
+        <w:t>Beth-Zatha</w:t>
+      </w:r>
+      <w:r>
+        <w:rPr>
+          <w:lang w:val="fr_FR" w:bidi="fr_FR"/>
+        </w:rPr>
+      </w:r>
+    </w:p>
+    <w:p>
+      <w:pPr/>
+      <w:r>
+        <w:rPr>
+          <w:lang w:val="fr_FR" w:bidi="fr_FR"/>
+        </w:rPr>
+      </w:r>
+      <w:r>
+        <w:rPr>
+          <w:lang w:val="fr_FR" w:bidi="fr_FR"/>
+        </w:rPr>
+        <w:t xml:space="preserve">Un des noms de la piscine où Jésus a guéri un paralytique dans </w:t>
+      </w:r>
+      <w:r>
+        <w:rPr>
+          <w:lang w:val="fr_FR" w:bidi="fr_FR"/>
+        </w:rPr>
+        <w:t>Jean 5.2</w:t>
+      </w:r>
+      <w:r>
+        <w:rPr>
+          <w:lang w:val="fr_FR" w:bidi="fr_FR"/>
+        </w:rPr>
+        <w:t>. Le nom le plus fréquemment adoptée dans les versions modernes est Béthesda (sur la base de nombreux manuscrits anciens). Cependant, certains manuscrits anciens lui donnent le nom de Beth-Zatha et d'autres encore, Bethsaïda. Beth-Zatha signifie probablement « maison des oliviers ».</w:t>
+      </w:r>
+    </w:p>
+    <w:p>
+      <w:pPr/>
+      <w:r>
+        <w:rPr>
+          <w:lang w:val="fr_FR" w:bidi="fr_FR"/>
+        </w:rPr>
+      </w:r>
+      <w:r>
+        <w:rPr>
+          <w:i/>
+          <w:lang w:val="fr_FR" w:bidi="fr_FR"/>
+        </w:rPr>
+        <w:t>Voir</w:t>
+      </w:r>
+      <w:r>
+        <w:rPr>
+          <w:lang w:val="fr_FR" w:bidi="fr_FR"/>
+        </w:rPr>
+        <w:t xml:space="preserve"> </w:t>
+      </w:r>
+      <w:r>
+        <w:rPr>
+          <w:lang w:val="fr_FR" w:bidi="fr_FR"/>
+        </w:rPr>
+        <w:t>Béthesda</w:t>
+      </w:r>
+      <w:r>
+        <w:rPr>
+          <w:lang w:val="fr_FR" w:bidi="fr_FR"/>
+        </w:rPr>
+        <w:t>.</w:t>
+      </w:r>
+      <w:r>
+        <w:rPr>
+          <w:lang w:val="fr_FR" w:bidi="fr_FR"/>
+        </w:rPr>
+      </w:r>
+      <w:r>
+        <w:rPr>
+          <w:lang w:val="fr_FR" w:bidi="fr_FR"/>
+        </w:rPr>
+      </w:r>
+    </w:p>
+    <w:p>
+      <w:pPr/>
+      <w:r>
+        <w:rPr>
+          <w:lang w:val="fr_FR" w:bidi="fr_FR"/>
+        </w:rPr>
+      </w:r>
+    </w:p>
+    <w:p>
+      <w:pPr>
+        <w:pStyle w:val="Heading2"/>
+      </w:pPr>
+      <w:r>
+        <w:rPr>
+          <w:lang w:val="fr_FR" w:bidi="fr_FR"/>
+        </w:rPr>
+        <w:t>Bethzeth</w:t>
+      </w:r>
+      <w:r>
+        <w:rPr>
+          <w:lang w:val="fr_FR" w:bidi="fr_FR"/>
+        </w:rPr>
+      </w:r>
+    </w:p>
+    <w:p>
+      <w:pPr/>
+      <w:r>
+        <w:rPr>
+          <w:lang w:val="fr_FR" w:bidi="fr_FR"/>
+        </w:rPr>
+      </w:r>
+      <w:r>
+        <w:rPr>
+          <w:lang w:val="fr_FR" w:bidi="fr_FR"/>
+        </w:rPr>
+        <w:t>Ville où Bakkhidès, général syrien de l’époque des Maccabées, établit son camp après avoir massacré 60 Juifs hassidiques à Jérusalem (1 M 7.19). À Bethzeth, d’autres Juifs sont tués, puis jetés dans une fosse. Bethzeth est identifiée comme étant un site près de Bethléhem.</w:t>
+      </w:r>
+      <w:r>
+        <w:rPr>
+          <w:lang w:val="fr_FR" w:bidi="fr_FR"/>
+        </w:rPr>
+      </w:r>
+      <w:r>
+        <w:rPr>
+          <w:lang w:val="fr_FR" w:bidi="fr_FR"/>
+        </w:rPr>
+      </w:r>
+    </w:p>
+    <w:p>
+      <w:pPr/>
+      <w:r>
+        <w:rPr>
+          <w:lang w:val="fr_FR" w:bidi="fr_FR"/>
+        </w:rPr>
+      </w:r>
+    </w:p>
+    <w:p>
+      <w:pPr>
+        <w:pStyle w:val="Heading2"/>
+      </w:pPr>
+      <w:r>
+        <w:rPr>
+          <w:lang w:val="fr_FR" w:bidi="fr_FR"/>
+        </w:rPr>
         <w:t>Betsaï</w:t>
       </w:r>
       <w:r>
@@ -49503,6 +52010,87 @@
         <w:rPr>
           <w:lang w:val="fr_FR" w:bidi="fr_FR"/>
         </w:rPr>
+        <w:t>bigamie</w:t>
+      </w:r>
+      <w:r>
+        <w:rPr>
+          <w:lang w:val="fr_FR" w:bidi="fr_FR"/>
+        </w:rPr>
+      </w:r>
+    </w:p>
+    <w:p>
+      <w:pPr/>
+      <w:r>
+        <w:rPr>
+          <w:lang w:val="fr_FR" w:bidi="fr_FR"/>
+        </w:rPr>
+      </w:r>
+      <w:r>
+        <w:rPr>
+          <w:lang w:val="fr_FR" w:bidi="fr_FR"/>
+        </w:rPr>
+        <w:t>La bigamie consiste à épouser une seconde femme alors qu’on est encore légalement marié à la première.</w:t>
+      </w:r>
+    </w:p>
+    <w:p>
+      <w:pPr/>
+      <w:r>
+        <w:rPr>
+          <w:lang w:val="fr_FR" w:bidi="fr_FR"/>
+        </w:rPr>
+      </w:r>
+      <w:r>
+        <w:rPr>
+          <w:i/>
+          <w:lang w:val="fr_FR" w:bidi="fr_FR"/>
+        </w:rPr>
+        <w:t>Voir</w:t>
+      </w:r>
+      <w:r>
+        <w:rPr>
+          <w:lang w:val="fr_FR" w:bidi="fr_FR"/>
+        </w:rPr>
+        <w:t xml:space="preserve"> </w:t>
+      </w:r>
+      <w:r>
+        <w:rPr>
+          <w:lang w:val="fr_FR" w:bidi="fr_FR"/>
+        </w:rPr>
+        <w:t>mariage, coutumes matrimoniales</w:t>
+      </w:r>
+      <w:r>
+        <w:rPr>
+          <w:lang w:val="fr_FR" w:bidi="fr_FR"/>
+        </w:rPr>
+        <w:t>.</w:t>
+      </w:r>
+      <w:r>
+        <w:rPr>
+          <w:lang w:val="fr_FR" w:bidi="fr_FR"/>
+        </w:rPr>
+      </w:r>
+      <w:r>
+        <w:rPr>
+          <w:lang w:val="fr_FR" w:bidi="fr_FR"/>
+        </w:rPr>
+      </w:r>
+    </w:p>
+    <w:p>
+      <w:pPr/>
+      <w:r>
+        <w:rPr>
+          <w:lang w:val="fr_FR" w:bidi="fr_FR"/>
+        </w:rPr>
+      </w:r>
+    </w:p>
+    <w:p>
+      <w:pPr>
+        <w:pStyle w:val="Heading2"/>
+      </w:pPr>
+      <w:r>
+        <w:rPr>
+          <w:lang w:val="fr_FR" w:bidi="fr_FR"/>
+        </w:rPr>
         <w:t>Bigtha</w:t>
       </w:r>
       <w:r>
@@ -53854,12 +56442,93 @@
         <w:rPr>
           <w:lang w:val="fr_FR" w:bidi="fr_FR"/>
         </w:rPr>
+        <w:t>Bokhim</w:t>
+      </w:r>
+      <w:r>
+        <w:rPr>
+          <w:lang w:val="fr_FR" w:bidi="fr_FR"/>
+        </w:rPr>
+      </w:r>
+    </w:p>
+    <w:p>
+      <w:pPr/>
+      <w:r>
+        <w:rPr>
+          <w:lang w:val="fr_FR" w:bidi="fr_FR"/>
+        </w:rPr>
+      </w:r>
+      <w:r>
+        <w:rPr>
+          <w:lang w:val="fr_FR" w:bidi="fr_FR"/>
+        </w:rPr>
+        <w:t>Autre orthographe de Bokim, lieu situé près de Guilgal.</w:t>
+      </w:r>
+    </w:p>
+    <w:p>
+      <w:pPr/>
+      <w:r>
+        <w:rPr>
+          <w:lang w:val="fr_FR" w:bidi="fr_FR"/>
+        </w:rPr>
+      </w:r>
+      <w:r>
+        <w:rPr>
+          <w:i/>
+          <w:lang w:val="fr_FR" w:bidi="fr_FR"/>
+        </w:rPr>
+        <w:t>Voir</w:t>
+      </w:r>
+      <w:r>
+        <w:rPr>
+          <w:lang w:val="fr_FR" w:bidi="fr_FR"/>
+        </w:rPr>
+        <w:t xml:space="preserve"> </w:t>
+      </w:r>
+      <w:r>
+        <w:rPr>
+          <w:lang w:val="fr_FR" w:bidi="fr_FR"/>
+        </w:rPr>
         <w:t>Bokim</w:t>
       </w:r>
       <w:r>
         <w:rPr>
           <w:lang w:val="fr_FR" w:bidi="fr_FR"/>
         </w:rPr>
+        <w:t>.</w:t>
+      </w:r>
+      <w:r>
+        <w:rPr>
+          <w:lang w:val="fr_FR" w:bidi="fr_FR"/>
+        </w:rPr>
+      </w:r>
+      <w:r>
+        <w:rPr>
+          <w:lang w:val="fr_FR" w:bidi="fr_FR"/>
+        </w:rPr>
+      </w:r>
+    </w:p>
+    <w:p>
+      <w:pPr/>
+      <w:r>
+        <w:rPr>
+          <w:lang w:val="fr_FR" w:bidi="fr_FR"/>
+        </w:rPr>
+      </w:r>
+    </w:p>
+    <w:p>
+      <w:pPr>
+        <w:pStyle w:val="Heading2"/>
+      </w:pPr>
+      <w:r>
+        <w:rPr>
+          <w:lang w:val="fr_FR" w:bidi="fr_FR"/>
+        </w:rPr>
+        <w:t>Bokim</w:t>
+      </w:r>
+      <w:r>
+        <w:rPr>
+          <w:lang w:val="fr_FR" w:bidi="fr_FR"/>
+        </w:rPr>
       </w:r>
     </w:p>
     <w:p>
@@ -53942,6 +56611,168 @@
         <w:rPr>
           <w:lang w:val="fr_FR" w:bidi="fr_FR"/>
         </w:rPr>
+        <w:t>Bokrou, Bocrou</w:t>
+      </w:r>
+      <w:r>
+        <w:rPr>
+          <w:lang w:val="fr_FR" w:bidi="fr_FR"/>
+        </w:rPr>
+      </w:r>
+    </w:p>
+    <w:p>
+      <w:pPr/>
+      <w:r>
+        <w:rPr>
+          <w:lang w:val="fr_FR" w:bidi="fr_FR"/>
+        </w:rPr>
+      </w:r>
+      <w:r>
+        <w:rPr>
+          <w:lang w:val="fr_FR" w:bidi="fr_FR"/>
+        </w:rPr>
+        <w:t>Autre orthographe de Bocru, fils d’Atsel.</w:t>
+      </w:r>
+    </w:p>
+    <w:p>
+      <w:pPr/>
+      <w:r>
+        <w:rPr>
+          <w:lang w:val="fr_FR" w:bidi="fr_FR"/>
+        </w:rPr>
+      </w:r>
+      <w:r>
+        <w:rPr>
+          <w:i/>
+          <w:lang w:val="fr_FR" w:bidi="fr_FR"/>
+        </w:rPr>
+        <w:t>Voir</w:t>
+      </w:r>
+      <w:r>
+        <w:rPr>
+          <w:lang w:val="fr_FR" w:bidi="fr_FR"/>
+        </w:rPr>
+        <w:t xml:space="preserve"> </w:t>
+      </w:r>
+      <w:r>
+        <w:rPr>
+          <w:lang w:val="fr_FR" w:bidi="fr_FR"/>
+        </w:rPr>
+        <w:t>Bocru</w:t>
+      </w:r>
+      <w:r>
+        <w:rPr>
+          <w:lang w:val="fr_FR" w:bidi="fr_FR"/>
+        </w:rPr>
+        <w:t>.</w:t>
+      </w:r>
+      <w:r>
+        <w:rPr>
+          <w:lang w:val="fr_FR" w:bidi="fr_FR"/>
+        </w:rPr>
+      </w:r>
+      <w:r>
+        <w:rPr>
+          <w:lang w:val="fr_FR" w:bidi="fr_FR"/>
+        </w:rPr>
+      </w:r>
+    </w:p>
+    <w:p>
+      <w:pPr/>
+      <w:r>
+        <w:rPr>
+          <w:lang w:val="fr_FR" w:bidi="fr_FR"/>
+        </w:rPr>
+      </w:r>
+    </w:p>
+    <w:p>
+      <w:pPr>
+        <w:pStyle w:val="Heading2"/>
+      </w:pPr>
+      <w:r>
+        <w:rPr>
+          <w:lang w:val="fr_FR" w:bidi="fr_FR"/>
+        </w:rPr>
+        <w:t>bol</w:t>
+      </w:r>
+      <w:r>
+        <w:rPr>
+          <w:lang w:val="fr_FR" w:bidi="fr_FR"/>
+        </w:rPr>
+      </w:r>
+    </w:p>
+    <w:p>
+      <w:pPr/>
+      <w:r>
+        <w:rPr>
+          <w:lang w:val="fr_FR" w:bidi="fr_FR"/>
+        </w:rPr>
+      </w:r>
+      <w:r>
+        <w:rPr>
+          <w:lang w:val="fr_FR" w:bidi="fr_FR"/>
+        </w:rPr>
+        <w:t>Récipient rond et profond utilisé pour contenir des aliments ou des liquides.</w:t>
+      </w:r>
+    </w:p>
+    <w:p>
+      <w:pPr/>
+      <w:r>
+        <w:rPr>
+          <w:lang w:val="fr_FR" w:bidi="fr_FR"/>
+        </w:rPr>
+      </w:r>
+      <w:r>
+        <w:rPr>
+          <w:i/>
+          <w:lang w:val="fr_FR" w:bidi="fr_FR"/>
+        </w:rPr>
+        <w:t>Voir</w:t>
+      </w:r>
+      <w:r>
+        <w:rPr>
+          <w:lang w:val="fr_FR" w:bidi="fr_FR"/>
+        </w:rPr>
+        <w:t xml:space="preserve"> </w:t>
+      </w:r>
+      <w:r>
+        <w:rPr>
+          <w:lang w:val="fr_FR" w:bidi="fr_FR"/>
+        </w:rPr>
+        <w:t>poterie</w:t>
+      </w:r>
+      <w:r>
+        <w:rPr>
+          <w:lang w:val="fr_FR" w:bidi="fr_FR"/>
+        </w:rPr>
+        <w:t>.</w:t>
+      </w:r>
+      <w:r>
+        <w:rPr>
+          <w:lang w:val="fr_FR" w:bidi="fr_FR"/>
+        </w:rPr>
+      </w:r>
+      <w:r>
+        <w:rPr>
+          <w:lang w:val="fr_FR" w:bidi="fr_FR"/>
+        </w:rPr>
+      </w:r>
+    </w:p>
+    <w:p>
+      <w:pPr/>
+      <w:r>
+        <w:rPr>
+          <w:lang w:val="fr_FR" w:bidi="fr_FR"/>
+        </w:rPr>
+      </w:r>
+    </w:p>
+    <w:p>
+      <w:pPr>
+        <w:pStyle w:val="Heading2"/>
+      </w:pPr>
+      <w:r>
+        <w:rPr>
+          <w:lang w:val="fr_FR" w:bidi="fr_FR"/>
+        </w:rPr>
         <w:t>Booz, Boes</w:t>
       </w:r>
       <w:r>
@@ -54213,6 +57044,193 @@
         <w:rPr>
           <w:lang w:val="fr_FR" w:bidi="fr_FR"/>
         </w:rPr>
+        <w:t>Bosor</w:t>
+      </w:r>
+      <w:r>
+        <w:rPr>
+          <w:lang w:val="fr_FR" w:bidi="fr_FR"/>
+        </w:rPr>
+      </w:r>
+    </w:p>
+    <w:p>
+      <w:pPr/>
+      <w:r>
+        <w:rPr>
+          <w:lang w:val="fr_FR" w:bidi="fr_FR"/>
+        </w:rPr>
+      </w:r>
+      <w:r>
+        <w:rPr>
+          <w:lang w:val="fr_FR" w:bidi="fr_FR"/>
+        </w:rPr>
+        <w:t>Autre orthographe du nom « Beor ». Beor est le père de Balaam (</w:t>
+      </w:r>
+      <w:r>
+        <w:rPr>
+          <w:lang w:val="fr_FR" w:bidi="fr_FR"/>
+        </w:rPr>
+        <w:t>2 Pierre 2.15</w:t>
+      </w:r>
+      <w:r>
+        <w:rPr>
+          <w:lang w:val="fr_FR" w:bidi="fr_FR"/>
+        </w:rPr>
+        <w:t>).</w:t>
+      </w:r>
+    </w:p>
+    <w:p>
+      <w:pPr/>
+      <w:r>
+        <w:rPr>
+          <w:lang w:val="fr_FR" w:bidi="fr_FR"/>
+        </w:rPr>
+      </w:r>
+      <w:r>
+        <w:rPr>
+          <w:i/>
+          <w:lang w:val="fr_FR" w:bidi="fr_FR"/>
+        </w:rPr>
+        <w:t>Voir</w:t>
+      </w:r>
+      <w:r>
+        <w:rPr>
+          <w:lang w:val="fr_FR" w:bidi="fr_FR"/>
+        </w:rPr>
+        <w:t xml:space="preserve"> </w:t>
+      </w:r>
+      <w:r>
+        <w:rPr>
+          <w:lang w:val="fr_FR" w:bidi="fr_FR"/>
+        </w:rPr>
+        <w:t>Beor n° 2</w:t>
+      </w:r>
+      <w:r>
+        <w:rPr>
+          <w:lang w:val="fr_FR" w:bidi="fr_FR"/>
+        </w:rPr>
+        <w:t>.</w:t>
+      </w:r>
+      <w:r>
+        <w:rPr>
+          <w:lang w:val="fr_FR" w:bidi="fr_FR"/>
+        </w:rPr>
+      </w:r>
+      <w:r>
+        <w:rPr>
+          <w:lang w:val="fr_FR" w:bidi="fr_FR"/>
+        </w:rPr>
+      </w:r>
+    </w:p>
+    <w:p>
+      <w:pPr/>
+      <w:r>
+        <w:rPr>
+          <w:lang w:val="fr_FR" w:bidi="fr_FR"/>
+        </w:rPr>
+      </w:r>
+    </w:p>
+    <w:p>
+      <w:pPr>
+        <w:pStyle w:val="Heading2"/>
+      </w:pPr>
+      <w:r>
+        <w:rPr>
+          <w:lang w:val="fr_FR" w:bidi="fr_FR"/>
+        </w:rPr>
+        <w:t>Bosora</w:t>
+      </w:r>
+      <w:r>
+        <w:rPr>
+          <w:lang w:val="fr_FR" w:bidi="fr_FR"/>
+        </w:rPr>
+      </w:r>
+    </w:p>
+    <w:p>
+      <w:pPr/>
+      <w:r>
+        <w:rPr>
+          <w:lang w:val="fr_FR" w:bidi="fr_FR"/>
+        </w:rPr>
+      </w:r>
+      <w:r>
+        <w:rPr>
+          <w:lang w:val="fr_FR" w:bidi="fr_FR"/>
+        </w:rPr>
+        <w:t>Ville de la région de Galaad dont Judas Maccabée s’empare pour secourir les Juifs qui y vivent (1 M 5.26, 36). Aujourd’hui, cet endroit s’appelle Busr El-Hariri.</w:t>
+      </w:r>
+    </w:p>
+    <w:p>
+      <w:pPr/>
+      <w:r>
+        <w:rPr>
+          <w:lang w:val="fr_FR" w:bidi="fr_FR"/>
+        </w:rPr>
+      </w:r>
+      <w:r>
+        <w:rPr>
+          <w:i/>
+          <w:lang w:val="fr_FR" w:bidi="fr_FR"/>
+        </w:rPr>
+        <w:t>Voir</w:t>
+      </w:r>
+      <w:r>
+        <w:rPr>
+          <w:lang w:val="fr_FR" w:bidi="fr_FR"/>
+        </w:rPr>
+        <w:t xml:space="preserve"> </w:t>
+      </w:r>
+      <w:r>
+        <w:rPr>
+          <w:lang w:val="fr_FR" w:bidi="fr_FR"/>
+        </w:rPr>
+        <w:t>Botsra n</w:t>
+      </w:r>
+      <w:r>
+        <w:rPr>
+          <w:vertAlign w:val="superscript"/>
+          <w:lang w:val="fr_FR" w:bidi="fr_FR"/>
+        </w:rPr>
+        <w:t>o</w:t>
+      </w:r>
+      <w:r>
+        <w:rPr>
+          <w:lang w:val="fr_FR" w:bidi="fr_FR"/>
+        </w:rPr>
+        <w:t xml:space="preserve"> 3</w:t>
+      </w:r>
+      <w:r>
+        <w:rPr>
+          <w:lang w:val="fr_FR" w:bidi="fr_FR"/>
+        </w:rPr>
+        <w:t>.</w:t>
+      </w:r>
+      <w:r>
+        <w:rPr>
+          <w:lang w:val="fr_FR" w:bidi="fr_FR"/>
+        </w:rPr>
+      </w:r>
+      <w:r>
+        <w:rPr>
+          <w:lang w:val="fr_FR" w:bidi="fr_FR"/>
+        </w:rPr>
+      </w:r>
+    </w:p>
+    <w:p>
+      <w:pPr/>
+      <w:r>
+        <w:rPr>
+          <w:lang w:val="fr_FR" w:bidi="fr_FR"/>
+        </w:rPr>
+      </w:r>
+    </w:p>
+    <w:p>
+      <w:pPr>
+        <w:pStyle w:val="Heading2"/>
+      </w:pPr>
+      <w:r>
+        <w:rPr>
+          <w:lang w:val="fr_FR" w:bidi="fr_FR"/>
+        </w:rPr>
         <w:t>Botsets</w:t>
       </w:r>
       <w:r>
@@ -54622,6 +57640,87 @@
           <w:lang w:val="fr_FR" w:bidi="fr_FR"/>
         </w:rPr>
         <w:t>Expiations, Jour des</w:t>
+      </w:r>
+      <w:r>
+        <w:rPr>
+          <w:lang w:val="fr_FR" w:bidi="fr_FR"/>
+        </w:rPr>
+        <w:t>.</w:t>
+      </w:r>
+      <w:r>
+        <w:rPr>
+          <w:lang w:val="fr_FR" w:bidi="fr_FR"/>
+        </w:rPr>
+      </w:r>
+      <w:r>
+        <w:rPr>
+          <w:lang w:val="fr_FR" w:bidi="fr_FR"/>
+        </w:rPr>
+      </w:r>
+    </w:p>
+    <w:p>
+      <w:pPr/>
+      <w:r>
+        <w:rPr>
+          <w:lang w:val="fr_FR" w:bidi="fr_FR"/>
+        </w:rPr>
+      </w:r>
+    </w:p>
+    <w:p>
+      <w:pPr>
+        <w:pStyle w:val="Heading2"/>
+      </w:pPr>
+      <w:r>
+        <w:rPr>
+          <w:lang w:val="fr_FR" w:bidi="fr_FR"/>
+        </w:rPr>
+        <w:t>bouclier</w:t>
+      </w:r>
+      <w:r>
+        <w:rPr>
+          <w:lang w:val="fr_FR" w:bidi="fr_FR"/>
+        </w:rPr>
+      </w:r>
+    </w:p>
+    <w:p>
+      <w:pPr/>
+      <w:r>
+        <w:rPr>
+          <w:lang w:val="fr_FR" w:bidi="fr_FR"/>
+        </w:rPr>
+      </w:r>
+      <w:r>
+        <w:rPr>
+          <w:lang w:val="fr_FR" w:bidi="fr_FR"/>
+        </w:rPr>
+        <w:t>Le bouclier est une arme défensive tenue à la main ou fixée au bras pendant le combat. Il était généralement rond.</w:t>
+      </w:r>
+    </w:p>
+    <w:p>
+      <w:pPr/>
+      <w:r>
+        <w:rPr>
+          <w:lang w:val="fr_FR" w:bidi="fr_FR"/>
+        </w:rPr>
+      </w:r>
+      <w:r>
+        <w:rPr>
+          <w:i/>
+          <w:lang w:val="fr_FR" w:bidi="fr_FR"/>
+        </w:rPr>
+        <w:t>Voir</w:t>
+      </w:r>
+      <w:r>
+        <w:rPr>
+          <w:lang w:val="fr_FR" w:bidi="fr_FR"/>
+        </w:rPr>
+        <w:t xml:space="preserve"> </w:t>
+      </w:r>
+      <w:r>
+        <w:rPr>
+          <w:lang w:val="fr_FR" w:bidi="fr_FR"/>
+        </w:rPr>
+        <w:t>armures et armes</w:t>
       </w:r>
       <w:r>
         <w:rPr>
@@ -55409,6 +58508,68 @@
         <w:rPr>
           <w:lang w:val="fr_FR" w:bidi="fr_FR"/>
         </w:rPr>
+        <w:t>bracelet</w:t>
+      </w:r>
+      <w:r>
+        <w:rPr>
+          <w:lang w:val="fr_FR" w:bidi="fr_FR"/>
+        </w:rPr>
+      </w:r>
+    </w:p>
+    <w:p>
+      <w:pPr/>
+      <w:r>
+        <w:rPr>
+          <w:lang w:val="fr_FR" w:bidi="fr_FR"/>
+        </w:rPr>
+      </w:r>
+      <w:r>
+        <w:rPr>
+          <w:lang w:val="fr_FR" w:bidi="fr_FR"/>
+        </w:rPr>
+        <w:t>Un bracelet est un bijou que l’on porte au poignet ou au bras.</w:t>
+      </w:r>
+    </w:p>
+    <w:p>
+      <w:pPr/>
+      <w:r>
+        <w:rPr>
+          <w:lang w:val="fr_FR" w:bidi="fr_FR"/>
+        </w:rPr>
+      </w:r>
+      <w:r>
+        <w:rPr>
+          <w:lang w:val="fr_FR" w:bidi="fr_FR"/>
+        </w:rPr>
+        <w:t>À l’époque biblique, les gens portaient des bracelets comme ornements. Certains étaient faits d’or, d’argent ou d’autres matériaux.</w:t>
+      </w:r>
+      <w:r>
+        <w:rPr>
+          <w:lang w:val="fr_FR" w:bidi="fr_FR"/>
+        </w:rPr>
+      </w:r>
+      <w:r>
+        <w:rPr>
+          <w:lang w:val="fr_FR" w:bidi="fr_FR"/>
+        </w:rPr>
+      </w:r>
+    </w:p>
+    <w:p>
+      <w:pPr/>
+      <w:r>
+        <w:rPr>
+          <w:lang w:val="fr_FR" w:bidi="fr_FR"/>
+        </w:rPr>
+      </w:r>
+    </w:p>
+    <w:p>
+      <w:pPr>
+        <w:pStyle w:val="Heading2"/>
+      </w:pPr>
+      <w:r>
+        <w:rPr>
+          <w:lang w:val="fr_FR" w:bidi="fr_FR"/>
+        </w:rPr>
         <w:t>Branche</w:t>
       </w:r>
       <w:r>
@@ -56546,6 +59707,180 @@
           <w:lang w:val="fr_FR" w:bidi="fr_FR"/>
         </w:rPr>
         <w:t>Tissu et fabrication de tissus</w:t>
+      </w:r>
+      <w:r>
+        <w:rPr>
+          <w:lang w:val="fr_FR" w:bidi="fr_FR"/>
+        </w:rPr>
+        <w:t>.</w:t>
+      </w:r>
+      <w:r>
+        <w:rPr>
+          <w:lang w:val="fr_FR" w:bidi="fr_FR"/>
+        </w:rPr>
+      </w:r>
+      <w:r>
+        <w:rPr>
+          <w:lang w:val="fr_FR" w:bidi="fr_FR"/>
+        </w:rPr>
+      </w:r>
+    </w:p>
+    <w:p>
+      <w:pPr/>
+      <w:r>
+        <w:rPr>
+          <w:lang w:val="fr_FR" w:bidi="fr_FR"/>
+        </w:rPr>
+      </w:r>
+    </w:p>
+    <w:p>
+      <w:pPr>
+        <w:pStyle w:val="Heading2"/>
+      </w:pPr>
+      <w:r>
+        <w:rPr>
+          <w:lang w:val="fr_FR" w:bidi="fr_FR"/>
+        </w:rPr>
+        <w:t>bronze</w:t>
+      </w:r>
+      <w:r>
+        <w:rPr>
+          <w:lang w:val="fr_FR" w:bidi="fr_FR"/>
+        </w:rPr>
+      </w:r>
+    </w:p>
+    <w:p>
+      <w:pPr/>
+      <w:r>
+        <w:rPr>
+          <w:lang w:val="fr_FR" w:bidi="fr_FR"/>
+        </w:rPr>
+      </w:r>
+      <w:r>
+        <w:rPr>
+          <w:lang w:val="fr_FR" w:bidi="fr_FR"/>
+        </w:rPr>
+        <w:t>Le bronze est un métal solide obtenu en mélangeant du cuivre et de l’étain. Dans l’Antiquité, on l’utilisait pour fabriquer des bijoux, des outils, des armes et des pièces de monnaie.</w:t>
+      </w:r>
+    </w:p>
+    <w:p>
+      <w:pPr/>
+      <w:r>
+        <w:rPr>
+          <w:lang w:val="fr_FR" w:bidi="fr_FR"/>
+        </w:rPr>
+      </w:r>
+      <w:r>
+        <w:rPr>
+          <w:i/>
+          <w:lang w:val="fr_FR" w:bidi="fr_FR"/>
+        </w:rPr>
+        <w:t>Voir</w:t>
+      </w:r>
+      <w:r>
+        <w:rPr>
+          <w:lang w:val="fr_FR" w:bidi="fr_FR"/>
+        </w:rPr>
+        <w:t xml:space="preserve"> </w:t>
+      </w:r>
+      <w:r>
+        <w:rPr>
+          <w:lang w:val="fr_FR" w:bidi="fr_FR"/>
+        </w:rPr>
+        <w:t>minéraux et métaux</w:t>
+      </w:r>
+      <w:r>
+        <w:rPr>
+          <w:lang w:val="fr_FR" w:bidi="fr_FR"/>
+        </w:rPr>
+        <w:t>.</w:t>
+      </w:r>
+      <w:r>
+        <w:rPr>
+          <w:lang w:val="fr_FR" w:bidi="fr_FR"/>
+        </w:rPr>
+      </w:r>
+      <w:r>
+        <w:rPr>
+          <w:lang w:val="fr_FR" w:bidi="fr_FR"/>
+        </w:rPr>
+      </w:r>
+    </w:p>
+    <w:p>
+      <w:pPr/>
+      <w:r>
+        <w:rPr>
+          <w:lang w:val="fr_FR" w:bidi="fr_FR"/>
+        </w:rPr>
+      </w:r>
+    </w:p>
+    <w:p>
+      <w:pPr>
+        <w:pStyle w:val="Heading2"/>
+      </w:pPr>
+      <w:r>
+        <w:rPr>
+          <w:lang w:val="fr_FR" w:bidi="fr_FR"/>
+        </w:rPr>
+        <w:t>broussailles</w:t>
+      </w:r>
+      <w:r>
+        <w:rPr>
+          <w:lang w:val="fr_FR" w:bidi="fr_FR"/>
+        </w:rPr>
+      </w:r>
+    </w:p>
+    <w:p>
+      <w:pPr/>
+      <w:r>
+        <w:rPr>
+          <w:lang w:val="fr_FR" w:bidi="fr_FR"/>
+        </w:rPr>
+      </w:r>
+      <w:r>
+        <w:rPr>
+          <w:lang w:val="fr_FR" w:bidi="fr_FR"/>
+        </w:rPr>
+        <w:t>Buisson épineux ou piquant. Cette plante est souvent mentionnée dans la Bible. Selon les versions, elle peut être désignée comme ronces, épines, buisson épineux, etc.</w:t>
+      </w:r>
+    </w:p>
+    <w:p>
+      <w:pPr/>
+      <w:r>
+        <w:rPr>
+          <w:lang w:val="fr_FR" w:bidi="fr_FR"/>
+        </w:rPr>
+      </w:r>
+      <w:r>
+        <w:rPr>
+          <w:i/>
+          <w:lang w:val="fr_FR" w:bidi="fr_FR"/>
+        </w:rPr>
+        <w:t>Voir</w:t>
+      </w:r>
+      <w:r>
+        <w:rPr>
+          <w:lang w:val="fr_FR" w:bidi="fr_FR"/>
+        </w:rPr>
+        <w:t xml:space="preserve"> </w:t>
+      </w:r>
+      <w:r>
+        <w:rPr>
+          <w:lang w:val="fr_FR" w:bidi="fr_FR"/>
+        </w:rPr>
+        <w:t>ronce</w:t>
+      </w:r>
+      <w:r>
+        <w:rPr>
+          <w:lang w:val="fr_FR" w:bidi="fr_FR"/>
+        </w:rPr>
+        <w:t xml:space="preserve"> ; </w:t>
+      </w:r>
+      <w:r>
+        <w:rPr>
+          <w:lang w:val="fr_FR" w:bidi="fr_FR"/>
+        </w:rPr>
+        <w:t>chardon, épine</w:t>
       </w:r>
       <w:r>
         <w:rPr>
@@ -58475,6 +61810,99 @@
           <w:lang w:val="fr_FR" w:bidi="fr_FR"/>
         </w:rPr>
         <w:t>).</w:t>
+      </w:r>
+      <w:r>
+        <w:rPr>
+          <w:lang w:val="fr_FR" w:bidi="fr_FR"/>
+        </w:rPr>
+      </w:r>
+      <w:r>
+        <w:rPr>
+          <w:lang w:val="fr_FR" w:bidi="fr_FR"/>
+        </w:rPr>
+      </w:r>
+    </w:p>
+    <w:p>
+      <w:pPr/>
+      <w:r>
+        <w:rPr>
+          <w:lang w:val="fr_FR" w:bidi="fr_FR"/>
+        </w:rPr>
+      </w:r>
+    </w:p>
+    <w:p>
+      <w:pPr>
+        <w:pStyle w:val="Heading2"/>
+      </w:pPr>
+      <w:r>
+        <w:rPr>
+          <w:lang w:val="fr_FR" w:bidi="fr_FR"/>
+        </w:rPr>
+        <w:t>Buzite</w:t>
+      </w:r>
+      <w:r>
+        <w:rPr>
+          <w:lang w:val="fr_FR" w:bidi="fr_FR"/>
+        </w:rPr>
+      </w:r>
+    </w:p>
+    <w:p>
+      <w:pPr/>
+      <w:r>
+        <w:rPr>
+          <w:lang w:val="fr_FR" w:bidi="fr_FR"/>
+        </w:rPr>
+      </w:r>
+      <w:r>
+        <w:rPr>
+          <w:lang w:val="fr_FR" w:bidi="fr_FR"/>
+        </w:rPr>
+        <w:t>Un Buzite était un habitant de Buz. Élihu, l’un des amis de Job, est présenté comme le fils de Barakeel, le Buzite (</w:t>
+      </w:r>
+      <w:r>
+        <w:rPr>
+          <w:lang w:val="fr_FR" w:bidi="fr_FR"/>
+        </w:rPr>
+        <w:t>Jb 32.2, 6</w:t>
+      </w:r>
+      <w:r>
+        <w:rPr>
+          <w:lang w:val="fr_FR" w:bidi="fr_FR"/>
+        </w:rPr>
+        <w:t>).</w:t>
+      </w:r>
+    </w:p>
+    <w:p>
+      <w:pPr/>
+      <w:r>
+        <w:rPr>
+          <w:lang w:val="fr_FR" w:bidi="fr_FR"/>
+        </w:rPr>
+      </w:r>
+      <w:r>
+        <w:rPr>
+          <w:i/>
+          <w:lang w:val="fr_FR" w:bidi="fr_FR"/>
+        </w:rPr>
+        <w:t>Voir</w:t>
+      </w:r>
+      <w:r>
+        <w:rPr>
+          <w:lang w:val="fr_FR" w:bidi="fr_FR"/>
+        </w:rPr>
+        <w:t xml:space="preserve"> </w:t>
+      </w:r>
+      <w:r>
+        <w:rPr>
+          <w:lang w:val="fr_FR" w:bidi="fr_FR"/>
+        </w:rPr>
+        <w:t>Buz (lieu)</w:t>
+      </w:r>
+      <w:r>
+        <w:rPr>
+          <w:lang w:val="fr_FR" w:bidi="fr_FR"/>
+        </w:rPr>
+        <w:t>.</w:t>
       </w:r>
       <w:r>
         <w:rPr>

</xml_diff>